<commit_message>
Lc 18.9-14: incorpora a transcrição revisada do sermão de 2022 (Apêndice J)
- Fases 1-5 consolidadas com as contribuições novas: 1Co 4.3-4
  (dedikaiōmai) como resposta a "só Deus pode me julgar"; o medo como
  motivo do zelo farisaico (leitura provável); o desigrejado; o "como"
  depois do pecado (2Co 7.10); o amor aos irmãos e o deleite (1Jo 4.20);
  sacerdote e sacrifício (Hb 7.27; 9.14); as formas de oração; a ressalva
  sobre "religião" (Tg 1.27); os meios de graça (BC 88)
- Corrige a afirmação sobre bater no peito (Lc 23.27) e registra novas
  correções na tabela 1.6
- Sermão: 1Co 4.3-4 no Ponto III (nova nota 24, 46 notas no total) e o
  disjuntor na transição para a Ceia; púlpito atualizado
- DOCX do estudo, do sermão e do púlpito gerados de novo

Co-Authored-By: Claude Opus 5.5 <noreply@anthropic.com>
Claude-Session: https://claude.ai/code/session_016AP7DND7rq258CjAhUiqMk
</commit_message>
<xml_diff>
--- a/estudos/lucas/18-9-14-estudo.docx
+++ b/estudos/lucas/18-9-14-estudo.docx
@@ -314,7 +314,7 @@
           <w:sz w:val="23"/>
           <w:szCs w:val="23"/>
         </w:rPr>
-        <w:t xml:space="preserve">: 2026-10-08 (versão consolidada das Fases 1-5: 2026-10-09)</w:t>
+        <w:t xml:space="preserve">: 2026-10-08 (versão consolidada das Fases 1-5: 2026-10-09; acréscimos do Apêndice J: 2026-10-11)</w:t>
       </w:r>
     </w:p>
     <w:p>
@@ -607,7 +607,7 @@
           <w:sz w:val="23"/>
           <w:szCs w:val="23"/>
         </w:rPr>
-        <w:t xml:space="preserve"> (Fases 1-5 reescritas em 2026-10-09 com tudo o que os materiais anexados acrescentaram). Análise de cada material nos Apêndices A a I</w:t>
+        <w:t xml:space="preserve"> (Fases 1-5 reescritas em 2026-10-09 com tudo o que os materiais anexados acrescentaram). Análise de cada material nos Apêndices A a J</w:t>
       </w:r>
     </w:p>
     <w:p>
@@ -4041,7 +4041,7 @@
           <w:sz w:val="23"/>
           <w:szCs w:val="23"/>
         </w:rPr>
-        <w:t xml:space="preserve">; olha para os lados. "No lugar dos atos de Deus, o fariseu pôs os seus" (Green): a oração começa como salmo de ação de graças, mas nunca menciona uma coisa que Deus fez</w:t>
+        <w:t xml:space="preserve">; olha para os lados. "No lugar dos atos de Deus, o fariseu pôs os seus" (Green): a oração começa como salmo de ação de graças, mas nunca menciona uma coisa que Deus fez. Das quatro formas clássicas de oração (adoração, confissão, ação de graças, súplica), nenhuma está ali de fato: não adora, não confessa, agradece por si mesmo e não pede (Allan 2022, que listou três formas; a que mais falta é a adoração, porque "Ó Deus" é a única palavra sobre Deus em toda a oração)</w:t>
       </w:r>
     </w:p>
     <w:p>
@@ -6033,7 +6033,85 @@
           <w:sz w:val="23"/>
           <w:szCs w:val="23"/>
         </w:rPr>
-        <w:t xml:space="preserve"> os "três mil" de Boice), e admirados. Para o primeiro público, o fariseu era o modelo de piedade, não o vilão caricato que o leitor cristão moderno já espera; a surpresa da parábola depende disso (Liefeld-Pao: "o leitor moderno não sente o golpe"). O movimento nasceu como resistência piedosa ao helenismo, e o jejum de duas vezes por semana remonta ao séc. II a.C.: o bem inicial "endureceu" em santarronice (Liefeld-Pao). O "a mais" do fariseu era a regra do seu grupo: a tradição oral exigia o jejum (Osborne; cf. 5.33). E os próprios mestres judeus condenavam a atitude: "Não te afastes da congregação e não confies em ti mesmo até o dia da tua morte, e não julgues o teu companheiro até que venhas a estar no lugar dele" (Hillel, m. </w:t>
+        <w:t xml:space="preserve"> os "três mil" de Boice), e admirados. Para o primeiro público, o fariseu era o modelo de piedade, não o vilão caricato que o leitor cristão moderno já espera; a surpresa da parábola depende disso (Liefeld-Pao: "o leitor moderno não sente o golpe"). O movimento nasceu como resistência piedosa ao helenismo, e o jejum de duas vezes por semana remonta ao séc. II a.C.: o bem inicial "endureceu" em santarronice (Liefeld-Pao). </w:t>
+      </w:r>
+      <w:r>
+        <w:rPr>
+          <w:rFonts w:ascii="Cambria" w:cs="Cambria" w:eastAsia="Cambria" w:hAnsi="Cambria"/>
+          <w:b/>
+          <w:bCs/>
+          <w:i w:val="false"/>
+          <w:iCs w:val="false"/>
+          <w:color w:val="2B2B33"/>
+          <w:sz w:val="23"/>
+          <w:szCs w:val="23"/>
+        </w:rPr>
+        <w:t xml:space="preserve">O motivo do zelo, leitura provável</w:t>
+      </w:r>
+      <w:r>
+        <w:rPr>
+          <w:rFonts w:ascii="Cambria" w:cs="Cambria" w:eastAsia="Cambria" w:hAnsi="Cambria"/>
+          <w:b w:val="false"/>
+          <w:bCs w:val="false"/>
+          <w:i w:val="false"/>
+          <w:iCs w:val="false"/>
+          <w:color w:val="2B2B33"/>
+          <w:sz w:val="23"/>
+          <w:szCs w:val="23"/>
+        </w:rPr>
+        <w:t xml:space="preserve"> (Allan 2022): a piedade do pós-exílio lia o cativeiro como castigo da desobediência ("todo o Israel transgrediu a tua lei… Por isso, as maldições… se derramaram sobre nós", Dn 9.11; cf. Ed 9.7; Ne 9.30), e o zelo pela Lei carregava o propósito de nunca mais repetir o exílio. A cerca em volta da Torá (m. </w:t>
+      </w:r>
+      <w:r>
+        <w:rPr>
+          <w:rFonts w:ascii="Cambria" w:cs="Cambria" w:eastAsia="Cambria" w:hAnsi="Cambria"/>
+          <w:b w:val="false"/>
+          <w:bCs w:val="false"/>
+          <w:i/>
+          <w:iCs/>
+          <w:color w:val="2B2B33"/>
+          <w:sz w:val="23"/>
+          <w:szCs w:val="23"/>
+        </w:rPr>
+        <w:t xml:space="preserve">Avot</w:t>
+      </w:r>
+      <w:r>
+        <w:rPr>
+          <w:rFonts w:ascii="Cambria" w:cs="Cambria" w:eastAsia="Cambria" w:hAnsi="Cambria"/>
+          <w:b w:val="false"/>
+          <w:bCs w:val="false"/>
+          <w:i w:val="false"/>
+          <w:iCs w:val="false"/>
+          <w:color w:val="2B2B33"/>
+          <w:sz w:val="23"/>
+          <w:szCs w:val="23"/>
+        </w:rPr>
+        <w:t xml:space="preserve"> 1.1) tem algo de </w:t>
+      </w:r>
+      <w:r>
+        <w:rPr>
+          <w:rFonts w:ascii="Cambria" w:cs="Cambria" w:eastAsia="Cambria" w:hAnsi="Cambria"/>
+          <w:b/>
+          <w:bCs/>
+          <w:i w:val="false"/>
+          <w:iCs w:val="false"/>
+          <w:color w:val="2B2B33"/>
+          <w:sz w:val="23"/>
+          <w:szCs w:val="23"/>
+        </w:rPr>
+        <w:t xml:space="preserve">muro contra o medo</w:t>
+      </w:r>
+      <w:r>
+        <w:rPr>
+          <w:rFonts w:ascii="Cambria" w:cs="Cambria" w:eastAsia="Cambria" w:hAnsi="Cambria"/>
+          <w:b w:val="false"/>
+          <w:bCs w:val="false"/>
+          <w:i w:val="false"/>
+          <w:iCs w:val="false"/>
+          <w:color w:val="2B2B33"/>
+          <w:sz w:val="23"/>
+          <w:szCs w:val="23"/>
+        </w:rPr>
+        <w:t xml:space="preserve">: obedecer para não perder de novo o favor de Deus. É a raiz que a Fase 3.1 descreve com Ferguson [o motivo é inferência a partir dessas orações, não declaração dos fariseus]. O "a mais" do fariseu era a regra do seu grupo: a tradição oral exigia o jejum (Osborne; cf. 5.33). E os próprios mestres judeus condenavam a atitude: "Não te afastes da congregação e não confies em ti mesmo até o dia da tua morte, e não julgues o teu companheiro até que venhas a estar no lugar dele" (Hillel, m. </w:t>
       </w:r>
       <w:r>
         <w:rPr>
@@ -6096,7 +6174,7 @@
           <w:sz w:val="23"/>
           <w:szCs w:val="23"/>
         </w:rPr>
-        <w:t xml:space="preserve"> (τελῶναι): judeus que cobravam impostos e taxas a serviço de Roma ou de seus aliados, por contrato de arrecadação, com fama de extorsão (3.12-13; 19.8) e vistos como traidores e impuros. As fontes rabínicas posteriores mostram a reputação: a casa em que um publicano entra fica impura (m. </w:t>
+        <w:t xml:space="preserve"> (τελῶναι): judeus que cobravam impostos e taxas a serviço de Roma ou de seus aliados, por contrato de arrecadação (arrematado por lance; o lucro vinha do que se cobrava acima do contratado), com fama de extorsão (3.12-13; 19.8) e vistos como traidores e impuros. As fontes rabínicas posteriores mostram a reputação: a casa em que um publicano entra fica impura (m. </w:t>
       </w:r>
       <w:r>
         <w:rPr>
@@ -7218,7 +7296,59 @@
           <w:sz w:val="23"/>
           <w:szCs w:val="23"/>
         </w:rPr>
-        <w:t xml:space="preserve">: gesto de mulheres em luto no Oriente Médio; homens só o fazem em angústia extrema (Bailey, com vinte anos de observação; Allan 2022). Na Bíblia, o gesto aparece só aqui e ao pé da cruz (23.48): "é necessário um acontecimento da magnitude do Gólgota para suscitar este gesto de homens do Oriente Médio" (Bailey). O peito, porque o coração é a fonte do mal (Mt 15.19; Midrash sobre Ec 7.2). O imperfeito (ἔτυπτεν) indica ação repetida: </w:t>
+        <w:t xml:space="preserve">: gesto de mulheres em luto no Oriente Médio; homens só o fazem em angústia extrema (Bailey, com vinte anos de observação; Allan 2022). A expressão do v. 13 (</w:t>
+      </w:r>
+      <w:r>
+        <w:rPr>
+          <w:rFonts w:ascii="Cambria" w:cs="Cambria" w:eastAsia="Cambria" w:hAnsi="Cambria"/>
+          <w:b w:val="false"/>
+          <w:bCs w:val="false"/>
+          <w:i/>
+          <w:iCs/>
+          <w:color w:val="2B2B33"/>
+          <w:sz w:val="23"/>
+          <w:szCs w:val="23"/>
+        </w:rPr>
+        <w:t xml:space="preserve">typtō to stēthos</w:t>
+      </w:r>
+      <w:r>
+        <w:rPr>
+          <w:rFonts w:ascii="Cambria" w:cs="Cambria" w:eastAsia="Cambria" w:hAnsi="Cambria"/>
+          <w:b w:val="false"/>
+          <w:bCs w:val="false"/>
+          <w:i w:val="false"/>
+          <w:iCs w:val="false"/>
+          <w:color w:val="2B2B33"/>
+          <w:sz w:val="23"/>
+          <w:szCs w:val="23"/>
+        </w:rPr>
+        <w:t xml:space="preserve">) só volta ao pé da cruz (23.48). O gesto aparece também, com outro verbo (</w:t>
+      </w:r>
+      <w:r>
+        <w:rPr>
+          <w:rFonts w:ascii="Cambria" w:cs="Cambria" w:eastAsia="Cambria" w:hAnsi="Cambria"/>
+          <w:b w:val="false"/>
+          <w:bCs w:val="false"/>
+          <w:i/>
+          <w:iCs/>
+          <w:color w:val="2B2B33"/>
+          <w:sz w:val="23"/>
+          <w:szCs w:val="23"/>
+        </w:rPr>
+        <w:t xml:space="preserve">koptō</w:t>
+      </w:r>
+      <w:r>
+        <w:rPr>
+          <w:rFonts w:ascii="Cambria" w:cs="Cambria" w:eastAsia="Cambria" w:hAnsi="Cambria"/>
+          <w:b w:val="false"/>
+          <w:bCs w:val="false"/>
+          <w:i w:val="false"/>
+          <w:iCs w:val="false"/>
+          <w:color w:val="2B2B33"/>
+          <w:sz w:val="23"/>
+          <w:szCs w:val="23"/>
+        </w:rPr>
+        <w:t xml:space="preserve">), nas "mulheres que batiam no peito e o lamentavam" a caminho do Calvário (23.27, NAA), o que confirma Bailey: é gesto de mulheres no luto, e os homens só o fazem diante do Gólgota. "É necessário um acontecimento da magnitude do Gólgota para suscitar este gesto de homens do Oriente Médio" (Bailey). O peito, porque o coração é a fonte do mal (Mt 15.19; Midrash sobre Ec 7.2). O imperfeito (ἔτυπτεν) indica ação repetida: </w:t>
       </w:r>
       <w:r>
         <w:rPr>
@@ -7769,6 +7899,147 @@
           <w:szCs w:val="23"/>
         </w:rPr>
         <w:t xml:space="preserve">: Israel advertido a não dizer no coração que entrou na terra por causa da própria justiça</w:t>
+      </w:r>
+    </w:p>
+    <w:p>
+      <w:pPr>
+        <w:pStyle w:val="ListParagraph"/>
+        <w:numPr>
+          <w:ilvl w:val="0"/>
+          <w:numId w:val="2"/>
+        </w:numPr>
+        <w:spacing w:after="70" w:before="0" w:line="288" w:lineRule="auto"/>
+        <w:jc w:val="left"/>
+      </w:pPr>
+      <w:r>
+        <w:rPr>
+          <w:rFonts w:ascii="Cambria" w:cs="Cambria" w:eastAsia="Cambria" w:hAnsi="Cambria"/>
+          <w:b/>
+          <w:bCs/>
+          <w:i w:val="false"/>
+          <w:iCs w:val="false"/>
+          <w:color w:val="2B2B33"/>
+          <w:sz w:val="23"/>
+          <w:szCs w:val="23"/>
+        </w:rPr>
+        <w:t xml:space="preserve">1Co 4.3-4</w:t>
+      </w:r>
+      <w:r>
+        <w:rPr>
+          <w:rFonts w:ascii="Cambria" w:cs="Cambria" w:eastAsia="Cambria" w:hAnsi="Cambria"/>
+          <w:b w:val="false"/>
+          <w:bCs w:val="false"/>
+          <w:i w:val="false"/>
+          <w:iCs w:val="false"/>
+          <w:color w:val="2B2B33"/>
+          <w:sz w:val="23"/>
+          <w:szCs w:val="23"/>
+        </w:rPr>
+        <w:t xml:space="preserve"> (a partir de Allan 2022, que respondeu à objeção "só Deus pode me julgar"): "Mas a mim pouco importa ser julgado por vocês ou por um tribunal humano; nem eu julgo a mim mesmo. Porque a consciência não me acusa de nada. Mas nem por isso me dou por justificado, pois quem me julga é o Senhor" (NAA). O verbo é o do v. 14: </w:t>
+      </w:r>
+      <w:r>
+        <w:rPr>
+          <w:rFonts w:ascii="Cambria" w:cs="Cambria" w:eastAsia="Cambria" w:hAnsi="Cambria"/>
+          <w:b w:val="false"/>
+          <w:bCs w:val="false"/>
+          <w:i/>
+          <w:iCs/>
+          <w:color w:val="2B2B33"/>
+          <w:sz w:val="23"/>
+          <w:szCs w:val="23"/>
+        </w:rPr>
+        <w:t xml:space="preserve">dedikaiōmai</w:t>
+      </w:r>
+      <w:r>
+        <w:rPr>
+          <w:rFonts w:ascii="Cambria" w:cs="Cambria" w:eastAsia="Cambria" w:hAnsi="Cambria"/>
+          <w:b w:val="false"/>
+          <w:bCs w:val="false"/>
+          <w:i w:val="false"/>
+          <w:iCs w:val="false"/>
+          <w:color w:val="2B2B33"/>
+          <w:sz w:val="23"/>
+          <w:szCs w:val="23"/>
+        </w:rPr>
+        <w:t xml:space="preserve">, perfeito passivo de </w:t>
+      </w:r>
+      <w:r>
+        <w:rPr>
+          <w:rFonts w:ascii="Cambria" w:cs="Cambria" w:eastAsia="Cambria" w:hAnsi="Cambria"/>
+          <w:b w:val="false"/>
+          <w:bCs w:val="false"/>
+          <w:i/>
+          <w:iCs/>
+          <w:color w:val="2B2B33"/>
+          <w:sz w:val="23"/>
+          <w:szCs w:val="23"/>
+        </w:rPr>
+        <w:t xml:space="preserve">dikaioō</w:t>
+      </w:r>
+      <w:r>
+        <w:rPr>
+          <w:rFonts w:ascii="Cambria" w:cs="Cambria" w:eastAsia="Cambria" w:hAnsi="Cambria"/>
+          <w:b w:val="false"/>
+          <w:bCs w:val="false"/>
+          <w:i w:val="false"/>
+          <w:iCs w:val="false"/>
+          <w:color w:val="2B2B33"/>
+          <w:sz w:val="23"/>
+          <w:szCs w:val="23"/>
+        </w:rPr>
+        <w:t xml:space="preserve"> (Lc 18.14: </w:t>
+      </w:r>
+      <w:r>
+        <w:rPr>
+          <w:rFonts w:ascii="Cambria" w:cs="Cambria" w:eastAsia="Cambria" w:hAnsi="Cambria"/>
+          <w:b w:val="false"/>
+          <w:bCs w:val="false"/>
+          <w:i/>
+          <w:iCs/>
+          <w:color w:val="2B2B33"/>
+          <w:sz w:val="23"/>
+          <w:szCs w:val="23"/>
+        </w:rPr>
+        <w:t xml:space="preserve">dedikaiōmenos</w:t>
+      </w:r>
+      <w:r>
+        <w:rPr>
+          <w:rFonts w:ascii="Cambria" w:cs="Cambria" w:eastAsia="Cambria" w:hAnsi="Cambria"/>
+          <w:b w:val="false"/>
+          <w:bCs w:val="false"/>
+          <w:i w:val="false"/>
+          <w:iCs w:val="false"/>
+          <w:color w:val="2B2B33"/>
+          <w:sz w:val="23"/>
+          <w:szCs w:val="23"/>
+        </w:rPr>
+        <w:t xml:space="preserve">). Três posturas diante do mesmo tribunal: </w:t>
+      </w:r>
+      <w:r>
+        <w:rPr>
+          <w:rFonts w:ascii="Cambria" w:cs="Cambria" w:eastAsia="Cambria" w:hAnsi="Cambria"/>
+          <w:b/>
+          <w:bCs/>
+          <w:i w:val="false"/>
+          <w:iCs w:val="false"/>
+          <w:color w:val="2B2B33"/>
+          <w:sz w:val="23"/>
+          <w:szCs w:val="23"/>
+        </w:rPr>
+        <w:t xml:space="preserve">o fariseu dá a si mesmo o veredito; Paulo se recusa a dá-lo, mesmo de consciência limpa; o publicano o recebe de Deus</w:t>
+      </w:r>
+      <w:r>
+        <w:rPr>
+          <w:rFonts w:ascii="Cambria" w:cs="Cambria" w:eastAsia="Cambria" w:hAnsi="Cambria"/>
+          <w:b w:val="false"/>
+          <w:bCs w:val="false"/>
+          <w:i w:val="false"/>
+          <w:iCs w:val="false"/>
+          <w:color w:val="2B2B33"/>
+          <w:sz w:val="23"/>
+          <w:szCs w:val="23"/>
+        </w:rPr>
+        <w:t xml:space="preserve">. É também a base bíblica do "esquecimento de si" (Keller; Fase 5.3)</w:t>
       </w:r>
     </w:p>
     <w:p>
@@ -11141,7 +11412,7 @@
                 <w:sz w:val="19"/>
                 <w:szCs w:val="19"/>
               </w:rPr>
-              <w:t xml:space="preserve">Gesto de luto extremo, raro em homens; só volta em 23.48 (</w:t>
+              <w:t xml:space="preserve">Gesto de luto extremo, raro em homens; a expressão só volta em 23.48 (</w:t>
             </w:r>
             <w:r>
               <w:rPr>
@@ -11167,7 +11438,33 @@
                 <w:sz w:val="19"/>
                 <w:szCs w:val="19"/>
               </w:rPr>
-              <w:t xml:space="preserve">) (Bailey)</w:t>
+              <w:t xml:space="preserve">) (Bailey); em 23.27 as mulheres "batiam no peito" com outro verbo (</w:t>
+            </w:r>
+            <w:r>
+              <w:rPr>
+                <w:rFonts w:ascii="Cambria" w:cs="Cambria" w:eastAsia="Cambria" w:hAnsi="Cambria"/>
+                <w:b w:val="false"/>
+                <w:bCs w:val="false"/>
+                <w:i/>
+                <w:iCs/>
+                <w:color w:val="2B2B33"/>
+                <w:sz w:val="19"/>
+                <w:szCs w:val="19"/>
+              </w:rPr>
+              <w:t xml:space="preserve">koptō</w:t>
+            </w:r>
+            <w:r>
+              <w:rPr>
+                <w:rFonts w:ascii="Cambria" w:cs="Cambria" w:eastAsia="Cambria" w:hAnsi="Cambria"/>
+                <w:b w:val="false"/>
+                <w:bCs w:val="false"/>
+                <w:i w:val="false"/>
+                <w:iCs w:val="false"/>
+                <w:color w:val="2B2B33"/>
+                <w:sz w:val="19"/>
+                <w:szCs w:val="19"/>
+              </w:rPr>
+              <w:t xml:space="preserve">)</w:t>
             </w:r>
           </w:p>
         </w:tc>
@@ -12537,9 +12834,9 @@
         </w:tblBorders>
       </w:tblPr>
       <w:tblGrid>
-        <w:gridCol w:w="1237"/>
-        <w:gridCol w:w="3438"/>
-        <w:gridCol w:w="3991"/>
+        <w:gridCol w:w="1498"/>
+        <w:gridCol w:w="2379"/>
+        <w:gridCol w:w="4789"/>
       </w:tblGrid>
       <w:tr>
         <w:trPr>
@@ -12547,7 +12844,7 @@
         </w:trPr>
         <w:tc>
           <w:tcPr>
-            <w:tcW w:type="dxa" w:w="1237"/>
+            <w:tcW w:type="dxa" w:w="1498"/>
             <w:tcBorders>
               <w:top w:val="single" w:color="E6DFD2" w:sz="2"/>
               <w:left w:val="single" w:color="E6DFD2" w:sz="2"/>
@@ -12584,7 +12881,7 @@
         </w:tc>
         <w:tc>
           <w:tcPr>
-            <w:tcW w:type="dxa" w:w="3438"/>
+            <w:tcW w:type="dxa" w:w="2379"/>
             <w:tcBorders>
               <w:top w:val="single" w:color="E6DFD2" w:sz="2"/>
               <w:left w:val="single" w:color="E6DFD2" w:sz="2"/>
@@ -12621,7 +12918,7 @@
         </w:tc>
         <w:tc>
           <w:tcPr>
-            <w:tcW w:type="dxa" w:w="3991"/>
+            <w:tcW w:type="dxa" w:w="4789"/>
             <w:tcBorders>
               <w:top w:val="single" w:color="E6DFD2" w:sz="2"/>
               <w:left w:val="single" w:color="E6DFD2" w:sz="2"/>
@@ -12663,7 +12960,7 @@
         </w:trPr>
         <w:tc>
           <w:tcPr>
-            <w:tcW w:type="dxa" w:w="1237"/>
+            <w:tcW w:type="dxa" w:w="1498"/>
             <w:tcBorders>
               <w:top w:val="single" w:color="E6DFD2" w:sz="2"/>
               <w:left w:val="single" w:color="E6DFD2" w:sz="2"/>
@@ -12700,7 +12997,7 @@
         </w:tc>
         <w:tc>
           <w:tcPr>
-            <w:tcW w:type="dxa" w:w="3438"/>
+            <w:tcW w:type="dxa" w:w="2379"/>
             <w:tcBorders>
               <w:top w:val="single" w:color="E6DFD2" w:sz="2"/>
               <w:left w:val="single" w:color="E6DFD2" w:sz="2"/>
@@ -12750,7 +13047,7 @@
         </w:tc>
         <w:tc>
           <w:tcPr>
-            <w:tcW w:type="dxa" w:w="3991"/>
+            <w:tcW w:type="dxa" w:w="4789"/>
             <w:tcBorders>
               <w:top w:val="single" w:color="E6DFD2" w:sz="2"/>
               <w:left w:val="single" w:color="E6DFD2" w:sz="2"/>
@@ -12805,7 +13102,7 @@
         </w:trPr>
         <w:tc>
           <w:tcPr>
-            <w:tcW w:type="dxa" w:w="1237"/>
+            <w:tcW w:type="dxa" w:w="1498"/>
             <w:tcBorders>
               <w:top w:val="single" w:color="E6DFD2" w:sz="2"/>
               <w:left w:val="single" w:color="E6DFD2" w:sz="2"/>
@@ -12842,7 +13139,7 @@
         </w:tc>
         <w:tc>
           <w:tcPr>
-            <w:tcW w:type="dxa" w:w="3438"/>
+            <w:tcW w:type="dxa" w:w="2379"/>
             <w:tcBorders>
               <w:top w:val="single" w:color="E6DFD2" w:sz="2"/>
               <w:left w:val="single" w:color="E6DFD2" w:sz="2"/>
@@ -12892,7 +13189,7 @@
         </w:tc>
         <w:tc>
           <w:tcPr>
-            <w:tcW w:type="dxa" w:w="3991"/>
+            <w:tcW w:type="dxa" w:w="4789"/>
             <w:tcBorders>
               <w:top w:val="single" w:color="E6DFD2" w:sz="2"/>
               <w:left w:val="single" w:color="E6DFD2" w:sz="2"/>
@@ -12934,7 +13231,7 @@
         </w:trPr>
         <w:tc>
           <w:tcPr>
-            <w:tcW w:type="dxa" w:w="1237"/>
+            <w:tcW w:type="dxa" w:w="1498"/>
             <w:tcBorders>
               <w:top w:val="single" w:color="E6DFD2" w:sz="2"/>
               <w:left w:val="single" w:color="E6DFD2" w:sz="2"/>
@@ -12971,7 +13268,7 @@
         </w:tc>
         <w:tc>
           <w:tcPr>
-            <w:tcW w:type="dxa" w:w="3438"/>
+            <w:tcW w:type="dxa" w:w="2379"/>
             <w:tcBorders>
               <w:top w:val="single" w:color="E6DFD2" w:sz="2"/>
               <w:left w:val="single" w:color="E6DFD2" w:sz="2"/>
@@ -13034,7 +13331,7 @@
         </w:tc>
         <w:tc>
           <w:tcPr>
-            <w:tcW w:type="dxa" w:w="3991"/>
+            <w:tcW w:type="dxa" w:w="4789"/>
             <w:tcBorders>
               <w:top w:val="single" w:color="E6DFD2" w:sz="2"/>
               <w:left w:val="single" w:color="E6DFD2" w:sz="2"/>
@@ -13076,7 +13373,7 @@
         </w:trPr>
         <w:tc>
           <w:tcPr>
-            <w:tcW w:type="dxa" w:w="1237"/>
+            <w:tcW w:type="dxa" w:w="1498"/>
             <w:tcBorders>
               <w:top w:val="single" w:color="E6DFD2" w:sz="2"/>
               <w:left w:val="single" w:color="E6DFD2" w:sz="2"/>
@@ -13113,7 +13410,7 @@
         </w:tc>
         <w:tc>
           <w:tcPr>
-            <w:tcW w:type="dxa" w:w="3438"/>
+            <w:tcW w:type="dxa" w:w="2379"/>
             <w:tcBorders>
               <w:top w:val="single" w:color="E6DFD2" w:sz="2"/>
               <w:left w:val="single" w:color="E6DFD2" w:sz="2"/>
@@ -13176,7 +13473,7 @@
         </w:tc>
         <w:tc>
           <w:tcPr>
-            <w:tcW w:type="dxa" w:w="3991"/>
+            <w:tcW w:type="dxa" w:w="4789"/>
             <w:tcBorders>
               <w:top w:val="single" w:color="E6DFD2" w:sz="2"/>
               <w:left w:val="single" w:color="E6DFD2" w:sz="2"/>
@@ -13244,7 +13541,7 @@
         </w:trPr>
         <w:tc>
           <w:tcPr>
-            <w:tcW w:type="dxa" w:w="1237"/>
+            <w:tcW w:type="dxa" w:w="1498"/>
             <w:tcBorders>
               <w:top w:val="single" w:color="E6DFD2" w:sz="2"/>
               <w:left w:val="single" w:color="E6DFD2" w:sz="2"/>
@@ -13281,7 +13578,7 @@
         </w:tc>
         <w:tc>
           <w:tcPr>
-            <w:tcW w:type="dxa" w:w="3438"/>
+            <w:tcW w:type="dxa" w:w="2379"/>
             <w:tcBorders>
               <w:top w:val="single" w:color="E6DFD2" w:sz="2"/>
               <w:left w:val="single" w:color="E6DFD2" w:sz="2"/>
@@ -13318,7 +13615,7 @@
         </w:tc>
         <w:tc>
           <w:tcPr>
-            <w:tcW w:type="dxa" w:w="3991"/>
+            <w:tcW w:type="dxa" w:w="4789"/>
             <w:tcBorders>
               <w:top w:val="single" w:color="E6DFD2" w:sz="2"/>
               <w:left w:val="single" w:color="E6DFD2" w:sz="2"/>
@@ -13360,7 +13657,7 @@
         </w:trPr>
         <w:tc>
           <w:tcPr>
-            <w:tcW w:type="dxa" w:w="1237"/>
+            <w:tcW w:type="dxa" w:w="1498"/>
             <w:tcBorders>
               <w:top w:val="single" w:color="E6DFD2" w:sz="2"/>
               <w:left w:val="single" w:color="E6DFD2" w:sz="2"/>
@@ -13397,7 +13694,7 @@
         </w:tc>
         <w:tc>
           <w:tcPr>
-            <w:tcW w:type="dxa" w:w="3438"/>
+            <w:tcW w:type="dxa" w:w="2379"/>
             <w:tcBorders>
               <w:top w:val="single" w:color="E6DFD2" w:sz="2"/>
               <w:left w:val="single" w:color="E6DFD2" w:sz="2"/>
@@ -13434,7 +13731,7 @@
         </w:tc>
         <w:tc>
           <w:tcPr>
-            <w:tcW w:type="dxa" w:w="3991"/>
+            <w:tcW w:type="dxa" w:w="4789"/>
             <w:tcBorders>
               <w:top w:val="single" w:color="E6DFD2" w:sz="2"/>
               <w:left w:val="single" w:color="E6DFD2" w:sz="2"/>
@@ -13476,7 +13773,7 @@
         </w:trPr>
         <w:tc>
           <w:tcPr>
-            <w:tcW w:type="dxa" w:w="1237"/>
+            <w:tcW w:type="dxa" w:w="1498"/>
             <w:tcBorders>
               <w:top w:val="single" w:color="E6DFD2" w:sz="2"/>
               <w:left w:val="single" w:color="E6DFD2" w:sz="2"/>
@@ -13513,7 +13810,7 @@
         </w:tc>
         <w:tc>
           <w:tcPr>
-            <w:tcW w:type="dxa" w:w="3438"/>
+            <w:tcW w:type="dxa" w:w="2379"/>
             <w:tcBorders>
               <w:top w:val="single" w:color="E6DFD2" w:sz="2"/>
               <w:left w:val="single" w:color="E6DFD2" w:sz="2"/>
@@ -13550,7 +13847,7 @@
         </w:tc>
         <w:tc>
           <w:tcPr>
-            <w:tcW w:type="dxa" w:w="3991"/>
+            <w:tcW w:type="dxa" w:w="4789"/>
             <w:tcBorders>
               <w:top w:val="single" w:color="E6DFD2" w:sz="2"/>
               <w:left w:val="single" w:color="E6DFD2" w:sz="2"/>
@@ -13618,7 +13915,7 @@
         </w:trPr>
         <w:tc>
           <w:tcPr>
-            <w:tcW w:type="dxa" w:w="1237"/>
+            <w:tcW w:type="dxa" w:w="1498"/>
             <w:tcBorders>
               <w:top w:val="single" w:color="E6DFD2" w:sz="2"/>
               <w:left w:val="single" w:color="E6DFD2" w:sz="2"/>
@@ -13655,7 +13952,7 @@
         </w:tc>
         <w:tc>
           <w:tcPr>
-            <w:tcW w:type="dxa" w:w="3438"/>
+            <w:tcW w:type="dxa" w:w="2379"/>
             <w:tcBorders>
               <w:top w:val="single" w:color="E6DFD2" w:sz="2"/>
               <w:left w:val="single" w:color="E6DFD2" w:sz="2"/>
@@ -13731,7 +14028,7 @@
         </w:tc>
         <w:tc>
           <w:tcPr>
-            <w:tcW w:type="dxa" w:w="3991"/>
+            <w:tcW w:type="dxa" w:w="4789"/>
             <w:tcBorders>
               <w:top w:val="single" w:color="E6DFD2" w:sz="2"/>
               <w:left w:val="single" w:color="E6DFD2" w:sz="2"/>
@@ -13786,7 +14083,7 @@
         </w:trPr>
         <w:tc>
           <w:tcPr>
-            <w:tcW w:type="dxa" w:w="1237"/>
+            <w:tcW w:type="dxa" w:w="1498"/>
             <w:tcBorders>
               <w:top w:val="single" w:color="E6DFD2" w:sz="2"/>
               <w:left w:val="single" w:color="E6DFD2" w:sz="2"/>
@@ -13823,7 +14120,7 @@
         </w:tc>
         <w:tc>
           <w:tcPr>
-            <w:tcW w:type="dxa" w:w="3438"/>
+            <w:tcW w:type="dxa" w:w="2379"/>
             <w:tcBorders>
               <w:top w:val="single" w:color="E6DFD2" w:sz="2"/>
               <w:left w:val="single" w:color="E6DFD2" w:sz="2"/>
@@ -13860,7 +14157,7 @@
         </w:tc>
         <w:tc>
           <w:tcPr>
-            <w:tcW w:type="dxa" w:w="3991"/>
+            <w:tcW w:type="dxa" w:w="4789"/>
             <w:tcBorders>
               <w:top w:val="single" w:color="E6DFD2" w:sz="2"/>
               <w:left w:val="single" w:color="E6DFD2" w:sz="2"/>
@@ -13902,7 +14199,7 @@
         </w:trPr>
         <w:tc>
           <w:tcPr>
-            <w:tcW w:type="dxa" w:w="1237"/>
+            <w:tcW w:type="dxa" w:w="1498"/>
             <w:tcBorders>
               <w:top w:val="single" w:color="E6DFD2" w:sz="2"/>
               <w:left w:val="single" w:color="E6DFD2" w:sz="2"/>
@@ -13939,7 +14236,7 @@
         </w:tc>
         <w:tc>
           <w:tcPr>
-            <w:tcW w:type="dxa" w:w="3438"/>
+            <w:tcW w:type="dxa" w:w="2379"/>
             <w:tcBorders>
               <w:top w:val="single" w:color="E6DFD2" w:sz="2"/>
               <w:left w:val="single" w:color="E6DFD2" w:sz="2"/>
@@ -14002,7 +14299,7 @@
         </w:tc>
         <w:tc>
           <w:tcPr>
-            <w:tcW w:type="dxa" w:w="3991"/>
+            <w:tcW w:type="dxa" w:w="4789"/>
             <w:tcBorders>
               <w:top w:val="single" w:color="E6DFD2" w:sz="2"/>
               <w:left w:val="single" w:color="E6DFD2" w:sz="2"/>
@@ -14044,7 +14341,7 @@
         </w:trPr>
         <w:tc>
           <w:tcPr>
-            <w:tcW w:type="dxa" w:w="1237"/>
+            <w:tcW w:type="dxa" w:w="1498"/>
             <w:tcBorders>
               <w:top w:val="single" w:color="E6DFD2" w:sz="2"/>
               <w:left w:val="single" w:color="E6DFD2" w:sz="2"/>
@@ -14081,7 +14378,7 @@
         </w:tc>
         <w:tc>
           <w:tcPr>
-            <w:tcW w:type="dxa" w:w="3438"/>
+            <w:tcW w:type="dxa" w:w="2379"/>
             <w:tcBorders>
               <w:top w:val="single" w:color="E6DFD2" w:sz="2"/>
               <w:left w:val="single" w:color="E6DFD2" w:sz="2"/>
@@ -14118,7 +14415,7 @@
         </w:tc>
         <w:tc>
           <w:tcPr>
-            <w:tcW w:type="dxa" w:w="3991"/>
+            <w:tcW w:type="dxa" w:w="4789"/>
             <w:tcBorders>
               <w:top w:val="single" w:color="E6DFD2" w:sz="2"/>
               <w:left w:val="single" w:color="E6DFD2" w:sz="2"/>
@@ -14160,7 +14457,7 @@
         </w:trPr>
         <w:tc>
           <w:tcPr>
-            <w:tcW w:type="dxa" w:w="1237"/>
+            <w:tcW w:type="dxa" w:w="1498"/>
             <w:tcBorders>
               <w:top w:val="single" w:color="E6DFD2" w:sz="2"/>
               <w:left w:val="single" w:color="E6DFD2" w:sz="2"/>
@@ -14197,7 +14494,7 @@
         </w:tc>
         <w:tc>
           <w:tcPr>
-            <w:tcW w:type="dxa" w:w="3438"/>
+            <w:tcW w:type="dxa" w:w="2379"/>
             <w:tcBorders>
               <w:top w:val="single" w:color="E6DFD2" w:sz="2"/>
               <w:left w:val="single" w:color="E6DFD2" w:sz="2"/>
@@ -14247,7 +14544,7 @@
         </w:tc>
         <w:tc>
           <w:tcPr>
-            <w:tcW w:type="dxa" w:w="3991"/>
+            <w:tcW w:type="dxa" w:w="4789"/>
             <w:tcBorders>
               <w:top w:val="single" w:color="E6DFD2" w:sz="2"/>
               <w:left w:val="single" w:color="E6DFD2" w:sz="2"/>
@@ -14289,7 +14586,7 @@
         </w:trPr>
         <w:tc>
           <w:tcPr>
-            <w:tcW w:type="dxa" w:w="1237"/>
+            <w:tcW w:type="dxa" w:w="1498"/>
             <w:tcBorders>
               <w:top w:val="single" w:color="E6DFD2" w:sz="2"/>
               <w:left w:val="single" w:color="E6DFD2" w:sz="2"/>
@@ -14326,7 +14623,7 @@
         </w:tc>
         <w:tc>
           <w:tcPr>
-            <w:tcW w:type="dxa" w:w="3438"/>
+            <w:tcW w:type="dxa" w:w="2379"/>
             <w:tcBorders>
               <w:top w:val="single" w:color="E6DFD2" w:sz="2"/>
               <w:left w:val="single" w:color="E6DFD2" w:sz="2"/>
@@ -14363,7 +14660,7 @@
         </w:tc>
         <w:tc>
           <w:tcPr>
-            <w:tcW w:type="dxa" w:w="3991"/>
+            <w:tcW w:type="dxa" w:w="4789"/>
             <w:tcBorders>
               <w:top w:val="single" w:color="E6DFD2" w:sz="2"/>
               <w:left w:val="single" w:color="E6DFD2" w:sz="2"/>
@@ -14405,7 +14702,7 @@
         </w:trPr>
         <w:tc>
           <w:tcPr>
-            <w:tcW w:type="dxa" w:w="1237"/>
+            <w:tcW w:type="dxa" w:w="1498"/>
             <w:tcBorders>
               <w:top w:val="single" w:color="E6DFD2" w:sz="2"/>
               <w:left w:val="single" w:color="E6DFD2" w:sz="2"/>
@@ -14442,7 +14739,7 @@
         </w:tc>
         <w:tc>
           <w:tcPr>
-            <w:tcW w:type="dxa" w:w="3438"/>
+            <w:tcW w:type="dxa" w:w="2379"/>
             <w:tcBorders>
               <w:top w:val="single" w:color="E6DFD2" w:sz="2"/>
               <w:left w:val="single" w:color="E6DFD2" w:sz="2"/>
@@ -14479,7 +14776,7 @@
         </w:tc>
         <w:tc>
           <w:tcPr>
-            <w:tcW w:type="dxa" w:w="3991"/>
+            <w:tcW w:type="dxa" w:w="4789"/>
             <w:tcBorders>
               <w:top w:val="single" w:color="E6DFD2" w:sz="2"/>
               <w:left w:val="single" w:color="E6DFD2" w:sz="2"/>
@@ -14521,7 +14818,7 @@
         </w:trPr>
         <w:tc>
           <w:tcPr>
-            <w:tcW w:type="dxa" w:w="1237"/>
+            <w:tcW w:type="dxa" w:w="1498"/>
             <w:tcBorders>
               <w:top w:val="single" w:color="E6DFD2" w:sz="2"/>
               <w:left w:val="single" w:color="E6DFD2" w:sz="2"/>
@@ -14558,7 +14855,7 @@
         </w:tc>
         <w:tc>
           <w:tcPr>
-            <w:tcW w:type="dxa" w:w="3438"/>
+            <w:tcW w:type="dxa" w:w="2379"/>
             <w:tcBorders>
               <w:top w:val="single" w:color="E6DFD2" w:sz="2"/>
               <w:left w:val="single" w:color="E6DFD2" w:sz="2"/>
@@ -14595,7 +14892,7 @@
         </w:tc>
         <w:tc>
           <w:tcPr>
-            <w:tcW w:type="dxa" w:w="3991"/>
+            <w:tcW w:type="dxa" w:w="4789"/>
             <w:tcBorders>
               <w:top w:val="single" w:color="E6DFD2" w:sz="2"/>
               <w:left w:val="single" w:color="E6DFD2" w:sz="2"/>
@@ -14637,7 +14934,7 @@
         </w:trPr>
         <w:tc>
           <w:tcPr>
-            <w:tcW w:type="dxa" w:w="1237"/>
+            <w:tcW w:type="dxa" w:w="1498"/>
             <w:tcBorders>
               <w:top w:val="single" w:color="E6DFD2" w:sz="2"/>
               <w:left w:val="single" w:color="E6DFD2" w:sz="2"/>
@@ -14674,7 +14971,7 @@
         </w:tc>
         <w:tc>
           <w:tcPr>
-            <w:tcW w:type="dxa" w:w="3438"/>
+            <w:tcW w:type="dxa" w:w="2379"/>
             <w:tcBorders>
               <w:top w:val="single" w:color="E6DFD2" w:sz="2"/>
               <w:left w:val="single" w:color="E6DFD2" w:sz="2"/>
@@ -14724,7 +15021,7 @@
         </w:tc>
         <w:tc>
           <w:tcPr>
-            <w:tcW w:type="dxa" w:w="3991"/>
+            <w:tcW w:type="dxa" w:w="4789"/>
             <w:tcBorders>
               <w:top w:val="single" w:color="E6DFD2" w:sz="2"/>
               <w:left w:val="single" w:color="E6DFD2" w:sz="2"/>
@@ -14766,7 +15063,7 @@
         </w:trPr>
         <w:tc>
           <w:tcPr>
-            <w:tcW w:type="dxa" w:w="1237"/>
+            <w:tcW w:type="dxa" w:w="1498"/>
             <w:tcBorders>
               <w:top w:val="single" w:color="E6DFD2" w:sz="2"/>
               <w:left w:val="single" w:color="E6DFD2" w:sz="2"/>
@@ -14803,7 +15100,7 @@
         </w:tc>
         <w:tc>
           <w:tcPr>
-            <w:tcW w:type="dxa" w:w="3438"/>
+            <w:tcW w:type="dxa" w:w="2379"/>
             <w:tcBorders>
               <w:top w:val="single" w:color="E6DFD2" w:sz="2"/>
               <w:left w:val="single" w:color="E6DFD2" w:sz="2"/>
@@ -14840,7 +15137,7 @@
         </w:tc>
         <w:tc>
           <w:tcPr>
-            <w:tcW w:type="dxa" w:w="3991"/>
+            <w:tcW w:type="dxa" w:w="4789"/>
             <w:tcBorders>
               <w:top w:val="single" w:color="E6DFD2" w:sz="2"/>
               <w:left w:val="single" w:color="E6DFD2" w:sz="2"/>
@@ -14882,7 +15179,7 @@
         </w:trPr>
         <w:tc>
           <w:tcPr>
-            <w:tcW w:type="dxa" w:w="1237"/>
+            <w:tcW w:type="dxa" w:w="1498"/>
             <w:tcBorders>
               <w:top w:val="single" w:color="E6DFD2" w:sz="2"/>
               <w:left w:val="single" w:color="E6DFD2" w:sz="2"/>
@@ -14919,7 +15216,7 @@
         </w:tc>
         <w:tc>
           <w:tcPr>
-            <w:tcW w:type="dxa" w:w="3438"/>
+            <w:tcW w:type="dxa" w:w="2379"/>
             <w:tcBorders>
               <w:top w:val="single" w:color="E6DFD2" w:sz="2"/>
               <w:left w:val="single" w:color="E6DFD2" w:sz="2"/>
@@ -14956,7 +15253,7 @@
         </w:tc>
         <w:tc>
           <w:tcPr>
-            <w:tcW w:type="dxa" w:w="3991"/>
+            <w:tcW w:type="dxa" w:w="4789"/>
             <w:tcBorders>
               <w:top w:val="single" w:color="E6DFD2" w:sz="2"/>
               <w:left w:val="single" w:color="E6DFD2" w:sz="2"/>
@@ -15024,7 +15321,7 @@
         </w:trPr>
         <w:tc>
           <w:tcPr>
-            <w:tcW w:type="dxa" w:w="1237"/>
+            <w:tcW w:type="dxa" w:w="1498"/>
             <w:tcBorders>
               <w:top w:val="single" w:color="E6DFD2" w:sz="2"/>
               <w:left w:val="single" w:color="E6DFD2" w:sz="2"/>
@@ -15061,7 +15358,7 @@
         </w:tc>
         <w:tc>
           <w:tcPr>
-            <w:tcW w:type="dxa" w:w="3438"/>
+            <w:tcW w:type="dxa" w:w="2379"/>
             <w:tcBorders>
               <w:top w:val="single" w:color="E6DFD2" w:sz="2"/>
               <w:left w:val="single" w:color="E6DFD2" w:sz="2"/>
@@ -15098,7 +15395,7 @@
         </w:tc>
         <w:tc>
           <w:tcPr>
-            <w:tcW w:type="dxa" w:w="3991"/>
+            <w:tcW w:type="dxa" w:w="4789"/>
             <w:tcBorders>
               <w:top w:val="single" w:color="E6DFD2" w:sz="2"/>
               <w:left w:val="single" w:color="E6DFD2" w:sz="2"/>
@@ -15140,7 +15437,7 @@
         </w:trPr>
         <w:tc>
           <w:tcPr>
-            <w:tcW w:type="dxa" w:w="1237"/>
+            <w:tcW w:type="dxa" w:w="1498"/>
             <w:tcBorders>
               <w:top w:val="single" w:color="E6DFD2" w:sz="2"/>
               <w:left w:val="single" w:color="E6DFD2" w:sz="2"/>
@@ -15177,7 +15474,7 @@
         </w:tc>
         <w:tc>
           <w:tcPr>
-            <w:tcW w:type="dxa" w:w="3438"/>
+            <w:tcW w:type="dxa" w:w="2379"/>
             <w:tcBorders>
               <w:top w:val="single" w:color="E6DFD2" w:sz="2"/>
               <w:left w:val="single" w:color="E6DFD2" w:sz="2"/>
@@ -15214,7 +15511,7 @@
         </w:tc>
         <w:tc>
           <w:tcPr>
-            <w:tcW w:type="dxa" w:w="3991"/>
+            <w:tcW w:type="dxa" w:w="4789"/>
             <w:tcBorders>
               <w:top w:val="single" w:color="E6DFD2" w:sz="2"/>
               <w:left w:val="single" w:color="E6DFD2" w:sz="2"/>
@@ -15256,7 +15553,7 @@
         </w:trPr>
         <w:tc>
           <w:tcPr>
-            <w:tcW w:type="dxa" w:w="1237"/>
+            <w:tcW w:type="dxa" w:w="1498"/>
             <w:tcBorders>
               <w:top w:val="single" w:color="E6DFD2" w:sz="2"/>
               <w:left w:val="single" w:color="E6DFD2" w:sz="2"/>
@@ -15287,13 +15584,13 @@
                 <w:sz w:val="19"/>
                 <w:szCs w:val="19"/>
               </w:rPr>
-              <w:t xml:space="preserve">Medeiros</w:t>
+              <w:t xml:space="preserve">Allan 2022; este estudo (1ª redação de 1.3)</w:t>
             </w:r>
           </w:p>
         </w:tc>
         <w:tc>
           <w:tcPr>
-            <w:tcW w:type="dxa" w:w="3438"/>
+            <w:tcW w:type="dxa" w:w="2379"/>
             <w:tcBorders>
               <w:top w:val="single" w:color="E6DFD2" w:sz="2"/>
               <w:left w:val="single" w:color="E6DFD2" w:sz="2"/>
@@ -15324,13 +15621,13 @@
                 <w:sz w:val="19"/>
                 <w:szCs w:val="19"/>
               </w:rPr>
-              <w:t xml:space="preserve">"Jerônimo se castrou"; "Lei negativa, evangelho positivo"</w:t>
+              <w:t xml:space="preserve">Na Bíblia, só em Lc 23.48 se bate no peito</w:t>
             </w:r>
           </w:p>
         </w:tc>
         <w:tc>
           <w:tcPr>
-            <w:tcW w:type="dxa" w:w="3991"/>
+            <w:tcW w:type="dxa" w:w="4789"/>
             <w:tcBorders>
               <w:top w:val="single" w:color="E6DFD2" w:sz="2"/>
               <w:left w:val="single" w:color="E6DFD2" w:sz="2"/>
@@ -15361,7 +15658,7 @@
                 <w:sz w:val="19"/>
                 <w:szCs w:val="19"/>
               </w:rPr>
-              <w:t xml:space="preserve">Orígenes (Eusébio, </w:t>
+              <w:t xml:space="preserve">A </w:t>
             </w:r>
             <w:r>
               <w:rPr>
@@ -15374,20 +15671,72 @@
                 <w:sz w:val="19"/>
                 <w:szCs w:val="19"/>
               </w:rPr>
-              <w:t xml:space="preserve">HE</w:t>
-            </w:r>
-            <w:r>
-              <w:rPr>
-                <w:rFonts w:ascii="Cambria" w:cs="Cambria" w:eastAsia="Cambria" w:hAnsi="Cambria"/>
-                <w:b w:val="false"/>
-                <w:bCs w:val="false"/>
-                <w:i w:val="false"/>
-                <w:iCs w:val="false"/>
-                <w:color w:val="2B2B33"/>
-                <w:sz w:val="19"/>
-                <w:szCs w:val="19"/>
-              </w:rPr>
-              <w:t xml:space="preserve"> VI.8); reformulado: a religião morta reduz a Lei aos "nãos"</w:t>
+              <w:t xml:space="preserve">expressão</w:t>
+            </w:r>
+            <w:r>
+              <w:rPr>
+                <w:rFonts w:ascii="Cambria" w:cs="Cambria" w:eastAsia="Cambria" w:hAnsi="Cambria"/>
+                <w:b w:val="false"/>
+                <w:bCs w:val="false"/>
+                <w:i w:val="false"/>
+                <w:iCs w:val="false"/>
+                <w:color w:val="2B2B33"/>
+                <w:sz w:val="19"/>
+                <w:szCs w:val="19"/>
+              </w:rPr>
+              <w:t xml:space="preserve"> do v. 13 só volta em 23.48; o </w:t>
+            </w:r>
+            <w:r>
+              <w:rPr>
+                <w:rFonts w:ascii="Cambria" w:cs="Cambria" w:eastAsia="Cambria" w:hAnsi="Cambria"/>
+                <w:b w:val="false"/>
+                <w:bCs w:val="false"/>
+                <w:i/>
+                <w:iCs/>
+                <w:color w:val="2B2B33"/>
+                <w:sz w:val="19"/>
+                <w:szCs w:val="19"/>
+              </w:rPr>
+              <w:t xml:space="preserve">gesto</w:t>
+            </w:r>
+            <w:r>
+              <w:rPr>
+                <w:rFonts w:ascii="Cambria" w:cs="Cambria" w:eastAsia="Cambria" w:hAnsi="Cambria"/>
+                <w:b w:val="false"/>
+                <w:bCs w:val="false"/>
+                <w:i w:val="false"/>
+                <w:iCs w:val="false"/>
+                <w:color w:val="2B2B33"/>
+                <w:sz w:val="19"/>
+                <w:szCs w:val="19"/>
+              </w:rPr>
+              <w:t xml:space="preserve"> aparece também em 23.27 (as mulheres, </w:t>
+            </w:r>
+            <w:r>
+              <w:rPr>
+                <w:rFonts w:ascii="Cambria" w:cs="Cambria" w:eastAsia="Cambria" w:hAnsi="Cambria"/>
+                <w:b w:val="false"/>
+                <w:bCs w:val="false"/>
+                <w:i/>
+                <w:iCs/>
+                <w:color w:val="2B2B33"/>
+                <w:sz w:val="19"/>
+                <w:szCs w:val="19"/>
+              </w:rPr>
+              <w:t xml:space="preserve">koptō</w:t>
+            </w:r>
+            <w:r>
+              <w:rPr>
+                <w:rFonts w:ascii="Cambria" w:cs="Cambria" w:eastAsia="Cambria" w:hAnsi="Cambria"/>
+                <w:b w:val="false"/>
+                <w:bCs w:val="false"/>
+                <w:i w:val="false"/>
+                <w:iCs w:val="false"/>
+                <w:color w:val="2B2B33"/>
+                <w:sz w:val="19"/>
+                <w:szCs w:val="19"/>
+              </w:rPr>
+              <w:t xml:space="preserve">)</w:t>
             </w:r>
           </w:p>
         </w:tc>
@@ -15398,7 +15747,7 @@
         </w:trPr>
         <w:tc>
           <w:tcPr>
-            <w:tcW w:type="dxa" w:w="1237"/>
+            <w:tcW w:type="dxa" w:w="1498"/>
             <w:tcBorders>
               <w:top w:val="single" w:color="E6DFD2" w:sz="2"/>
               <w:left w:val="single" w:color="E6DFD2" w:sz="2"/>
@@ -15429,13 +15778,13 @@
                 <w:sz w:val="19"/>
                 <w:szCs w:val="19"/>
               </w:rPr>
-              <w:t xml:space="preserve">Keller (sermão)</w:t>
+              <w:t xml:space="preserve">Allan 2022</w:t>
             </w:r>
           </w:p>
         </w:tc>
         <w:tc>
           <w:tcPr>
-            <w:tcW w:type="dxa" w:w="3438"/>
+            <w:tcW w:type="dxa" w:w="2379"/>
             <w:tcBorders>
               <w:top w:val="single" w:color="E6DFD2" w:sz="2"/>
               <w:left w:val="single" w:color="E6DFD2" w:sz="2"/>
@@ -15466,26 +15815,13 @@
                 <w:sz w:val="19"/>
                 <w:szCs w:val="19"/>
               </w:rPr>
-              <w:t xml:space="preserve">A palavra do v. 13 é </w:t>
-            </w:r>
-            <w:r>
-              <w:rPr>
-                <w:rFonts w:ascii="Cambria" w:cs="Cambria" w:eastAsia="Cambria" w:hAnsi="Cambria"/>
-                <w:b w:val="false"/>
-                <w:bCs w:val="false"/>
-                <w:i/>
-                <w:iCs/>
-                <w:color w:val="2B2B33"/>
-                <w:sz w:val="19"/>
-                <w:szCs w:val="19"/>
-              </w:rPr>
-              <w:t xml:space="preserve">hilastērion</w:t>
+              <w:t xml:space="preserve">O estilo dos Evangelhos "é único no mundo"</w:t>
             </w:r>
           </w:p>
         </w:tc>
         <w:tc>
           <w:tcPr>
-            <w:tcW w:type="dxa" w:w="3991"/>
+            <w:tcW w:type="dxa" w:w="4789"/>
             <w:tcBorders>
               <w:top w:val="single" w:color="E6DFD2" w:sz="2"/>
               <w:left w:val="single" w:color="E6DFD2" w:sz="2"/>
@@ -15516,7 +15852,7 @@
                 <w:sz w:val="19"/>
                 <w:szCs w:val="19"/>
               </w:rPr>
-              <w:t xml:space="preserve">É o verbo cognato </w:t>
+              <w:t xml:space="preserve">Os Evangelhos se aproximam das biografias greco-romanas (</w:t>
             </w:r>
             <w:r>
               <w:rPr>
@@ -15529,7 +15865,20 @@
                 <w:sz w:val="19"/>
                 <w:szCs w:val="19"/>
               </w:rPr>
-              <w:t xml:space="preserve">hilaskomai</w:t>
+              <w:t xml:space="preserve">bioi</w:t>
+            </w:r>
+            <w:r>
+              <w:rPr>
+                <w:rFonts w:ascii="Cambria" w:cs="Cambria" w:eastAsia="Cambria" w:hAnsi="Cambria"/>
+                <w:b w:val="false"/>
+                <w:bCs w:val="false"/>
+                <w:i w:val="false"/>
+                <w:iCs w:val="false"/>
+                <w:color w:val="2B2B33"/>
+                <w:sz w:val="19"/>
+                <w:szCs w:val="19"/>
+              </w:rPr>
+              <w:t xml:space="preserve">; Burridge); o ponto certo é a ordem intencional de Lucas ("uma exposição em ordem", Lc 1.3)</w:t>
             </w:r>
           </w:p>
         </w:tc>
@@ -15540,7 +15889,7 @@
         </w:trPr>
         <w:tc>
           <w:tcPr>
-            <w:tcW w:type="dxa" w:w="1237"/>
+            <w:tcW w:type="dxa" w:w="1498"/>
             <w:tcBorders>
               <w:top w:val="single" w:color="E6DFD2" w:sz="2"/>
               <w:left w:val="single" w:color="E6DFD2" w:sz="2"/>
@@ -15571,13 +15920,13 @@
                 <w:sz w:val="19"/>
                 <w:szCs w:val="19"/>
               </w:rPr>
-              <w:t xml:space="preserve">Wright</w:t>
+              <w:t xml:space="preserve">Allan 2022</w:t>
             </w:r>
           </w:p>
         </w:tc>
         <w:tc>
           <w:tcPr>
-            <w:tcW w:type="dxa" w:w="3438"/>
+            <w:tcW w:type="dxa" w:w="2379"/>
             <w:tcBorders>
               <w:top w:val="single" w:color="E6DFD2" w:sz="2"/>
               <w:left w:val="single" w:color="E6DFD2" w:sz="2"/>
@@ -15608,13 +15957,13 @@
                 <w:sz w:val="19"/>
                 <w:szCs w:val="19"/>
               </w:rPr>
-              <w:t xml:space="preserve">Justificação final "após a vida de sofrimento, santidade e serviço"</w:t>
+              <w:t xml:space="preserve">O cargo de publicano comprado com propina</w:t>
             </w:r>
           </w:p>
         </w:tc>
         <w:tc>
           <w:tcPr>
-            <w:tcW w:type="dxa" w:w="3991"/>
+            <w:tcW w:type="dxa" w:w="4789"/>
             <w:tcBorders>
               <w:top w:val="single" w:color="E6DFD2" w:sz="2"/>
               <w:left w:val="single" w:color="E6DFD2" w:sz="2"/>
@@ -15645,6 +15994,613 @@
                 <w:sz w:val="19"/>
                 <w:szCs w:val="19"/>
               </w:rPr>
+              <w:t xml:space="preserve">Contrato arrematado por lance; a extorsão estava na cobrança</w:t>
+            </w:r>
+          </w:p>
+        </w:tc>
+      </w:tr>
+      <w:tr>
+        <w:trPr>
+          <w:tblHeader w:val="false"/>
+        </w:trPr>
+        <w:tc>
+          <w:tcPr>
+            <w:tcW w:type="dxa" w:w="1498"/>
+            <w:tcBorders>
+              <w:top w:val="single" w:color="E6DFD2" w:sz="2"/>
+              <w:left w:val="single" w:color="E6DFD2" w:sz="2"/>
+              <w:bottom w:val="single" w:color="E6DFD2" w:sz="2"/>
+              <w:right w:val="single" w:color="E6DFD2" w:sz="2"/>
+            </w:tcBorders>
+            <w:shd w:fill="F4F1EA" w:val="clear"/>
+            <w:tcMar>
+              <w:top w:type="dxa" w:w="70"/>
+              <w:left w:type="dxa" w:w="110"/>
+              <w:bottom w:type="dxa" w:w="70"/>
+              <w:right w:type="dxa" w:w="110"/>
+            </w:tcMar>
+          </w:tcPr>
+          <w:p>
+            <w:pPr>
+              <w:spacing w:after="0" w:before="0" w:line="252" w:lineRule="auto"/>
+              <w:jc w:val="left"/>
+            </w:pPr>
+            <w:r>
+              <w:rPr>
+                <w:rFonts w:ascii="Cambria" w:cs="Cambria" w:eastAsia="Cambria" w:hAnsi="Cambria"/>
+                <w:b w:val="false"/>
+                <w:bCs w:val="false"/>
+                <w:i w:val="false"/>
+                <w:iCs w:val="false"/>
+                <w:color w:val="2B2B33"/>
+                <w:sz w:val="19"/>
+                <w:szCs w:val="19"/>
+              </w:rPr>
+              <w:t xml:space="preserve">Allan 2022</w:t>
+            </w:r>
+          </w:p>
+        </w:tc>
+        <w:tc>
+          <w:tcPr>
+            <w:tcW w:type="dxa" w:w="2379"/>
+            <w:tcBorders>
+              <w:top w:val="single" w:color="E6DFD2" w:sz="2"/>
+              <w:left w:val="single" w:color="E6DFD2" w:sz="2"/>
+              <w:bottom w:val="single" w:color="E6DFD2" w:sz="2"/>
+              <w:right w:val="single" w:color="E6DFD2" w:sz="2"/>
+            </w:tcBorders>
+            <w:shd w:fill="F4F1EA" w:val="clear"/>
+            <w:tcMar>
+              <w:top w:type="dxa" w:w="70"/>
+              <w:left w:type="dxa" w:w="110"/>
+              <w:bottom w:type="dxa" w:w="70"/>
+              <w:right w:type="dxa" w:w="110"/>
+            </w:tcMar>
+          </w:tcPr>
+          <w:p>
+            <w:pPr>
+              <w:spacing w:after="0" w:before="0" w:line="252" w:lineRule="auto"/>
+              <w:jc w:val="left"/>
+            </w:pPr>
+            <w:r>
+              <w:rPr>
+                <w:rFonts w:ascii="Cambria" w:cs="Cambria" w:eastAsia="Cambria" w:hAnsi="Cambria"/>
+                <w:b w:val="false"/>
+                <w:bCs w:val="false"/>
+                <w:i w:val="false"/>
+                <w:iCs w:val="false"/>
+                <w:color w:val="2B2B33"/>
+                <w:sz w:val="19"/>
+                <w:szCs w:val="19"/>
+              </w:rPr>
+              <w:t xml:space="preserve">"Religião" vem de </w:t>
+            </w:r>
+            <w:r>
+              <w:rPr>
+                <w:rFonts w:ascii="Cambria" w:cs="Cambria" w:eastAsia="Cambria" w:hAnsi="Cambria"/>
+                <w:b w:val="false"/>
+                <w:bCs w:val="false"/>
+                <w:i/>
+                <w:iCs/>
+                <w:color w:val="2B2B33"/>
+                <w:sz w:val="19"/>
+                <w:szCs w:val="19"/>
+              </w:rPr>
+              <w:t xml:space="preserve">religare</w:t>
+            </w:r>
+          </w:p>
+        </w:tc>
+        <w:tc>
+          <w:tcPr>
+            <w:tcW w:type="dxa" w:w="4789"/>
+            <w:tcBorders>
+              <w:top w:val="single" w:color="E6DFD2" w:sz="2"/>
+              <w:left w:val="single" w:color="E6DFD2" w:sz="2"/>
+              <w:bottom w:val="single" w:color="E6DFD2" w:sz="2"/>
+              <w:right w:val="single" w:color="E6DFD2" w:sz="2"/>
+            </w:tcBorders>
+            <w:shd w:fill="F4F1EA" w:val="clear"/>
+            <w:tcMar>
+              <w:top w:type="dxa" w:w="70"/>
+              <w:left w:type="dxa" w:w="110"/>
+              <w:bottom w:type="dxa" w:w="70"/>
+              <w:right w:type="dxa" w:w="110"/>
+            </w:tcMar>
+          </w:tcPr>
+          <w:p>
+            <w:pPr>
+              <w:spacing w:after="0" w:before="0" w:line="252" w:lineRule="auto"/>
+              <w:jc w:val="left"/>
+            </w:pPr>
+            <w:r>
+              <w:rPr>
+                <w:rFonts w:ascii="Cambria" w:cs="Cambria" w:eastAsia="Cambria" w:hAnsi="Cambria"/>
+                <w:b w:val="false"/>
+                <w:bCs w:val="false"/>
+                <w:i w:val="false"/>
+                <w:iCs w:val="false"/>
+                <w:color w:val="2B2B33"/>
+                <w:sz w:val="19"/>
+                <w:szCs w:val="19"/>
+              </w:rPr>
+              <w:t xml:space="preserve">Etimologia de Lactâncio (</w:t>
+            </w:r>
+            <w:r>
+              <w:rPr>
+                <w:rFonts w:ascii="Cambria" w:cs="Cambria" w:eastAsia="Cambria" w:hAnsi="Cambria"/>
+                <w:b w:val="false"/>
+                <w:bCs w:val="false"/>
+                <w:i/>
+                <w:iCs/>
+                <w:color w:val="2B2B33"/>
+                <w:sz w:val="19"/>
+                <w:szCs w:val="19"/>
+              </w:rPr>
+              <w:t xml:space="preserve">Div. Inst.</w:t>
+            </w:r>
+            <w:r>
+              <w:rPr>
+                <w:rFonts w:ascii="Cambria" w:cs="Cambria" w:eastAsia="Cambria" w:hAnsi="Cambria"/>
+                <w:b w:val="false"/>
+                <w:bCs w:val="false"/>
+                <w:i w:val="false"/>
+                <w:iCs w:val="false"/>
+                <w:color w:val="2B2B33"/>
+                <w:sz w:val="19"/>
+                <w:szCs w:val="19"/>
+              </w:rPr>
+              <w:t xml:space="preserve"> IV.28), disputada desde Cícero (</w:t>
+            </w:r>
+            <w:r>
+              <w:rPr>
+                <w:rFonts w:ascii="Cambria" w:cs="Cambria" w:eastAsia="Cambria" w:hAnsi="Cambria"/>
+                <w:b w:val="false"/>
+                <w:bCs w:val="false"/>
+                <w:i/>
+                <w:iCs/>
+                <w:color w:val="2B2B33"/>
+                <w:sz w:val="19"/>
+                <w:szCs w:val="19"/>
+              </w:rPr>
+              <w:t xml:space="preserve">relegere</w:t>
+            </w:r>
+            <w:r>
+              <w:rPr>
+                <w:rFonts w:ascii="Cambria" w:cs="Cambria" w:eastAsia="Cambria" w:hAnsi="Cambria"/>
+                <w:b w:val="false"/>
+                <w:bCs w:val="false"/>
+                <w:i w:val="false"/>
+                <w:iCs w:val="false"/>
+                <w:color w:val="2B2B33"/>
+                <w:sz w:val="19"/>
+                <w:szCs w:val="19"/>
+              </w:rPr>
+              <w:t xml:space="preserve">, </w:t>
+            </w:r>
+            <w:r>
+              <w:rPr>
+                <w:rFonts w:ascii="Cambria" w:cs="Cambria" w:eastAsia="Cambria" w:hAnsi="Cambria"/>
+                <w:b w:val="false"/>
+                <w:bCs w:val="false"/>
+                <w:i/>
+                <w:iCs/>
+                <w:color w:val="2B2B33"/>
+                <w:sz w:val="19"/>
+                <w:szCs w:val="19"/>
+              </w:rPr>
+              <w:t xml:space="preserve">De nat. deorum</w:t>
+            </w:r>
+            <w:r>
+              <w:rPr>
+                <w:rFonts w:ascii="Cambria" w:cs="Cambria" w:eastAsia="Cambria" w:hAnsi="Cambria"/>
+                <w:b w:val="false"/>
+                <w:bCs w:val="false"/>
+                <w:i w:val="false"/>
+                <w:iCs w:val="false"/>
+                <w:color w:val="2B2B33"/>
+                <w:sz w:val="19"/>
+                <w:szCs w:val="19"/>
+              </w:rPr>
+              <w:t xml:space="preserve"> II.72); não fundamentar argumento nela</w:t>
+            </w:r>
+          </w:p>
+        </w:tc>
+      </w:tr>
+      <w:tr>
+        <w:trPr>
+          <w:tblHeader w:val="false"/>
+        </w:trPr>
+        <w:tc>
+          <w:tcPr>
+            <w:tcW w:type="dxa" w:w="1498"/>
+            <w:tcBorders>
+              <w:top w:val="single" w:color="E6DFD2" w:sz="2"/>
+              <w:left w:val="single" w:color="E6DFD2" w:sz="2"/>
+              <w:bottom w:val="single" w:color="E6DFD2" w:sz="2"/>
+              <w:right w:val="single" w:color="E6DFD2" w:sz="2"/>
+            </w:tcBorders>
+            <w:shd w:fill="FFFFFF" w:val="clear"/>
+            <w:tcMar>
+              <w:top w:type="dxa" w:w="70"/>
+              <w:left w:type="dxa" w:w="110"/>
+              <w:bottom w:type="dxa" w:w="70"/>
+              <w:right w:type="dxa" w:w="110"/>
+            </w:tcMar>
+          </w:tcPr>
+          <w:p>
+            <w:pPr>
+              <w:spacing w:after="0" w:before="0" w:line="252" w:lineRule="auto"/>
+              <w:jc w:val="left"/>
+            </w:pPr>
+            <w:r>
+              <w:rPr>
+                <w:rFonts w:ascii="Cambria" w:cs="Cambria" w:eastAsia="Cambria" w:hAnsi="Cambria"/>
+                <w:b w:val="false"/>
+                <w:bCs w:val="false"/>
+                <w:i w:val="false"/>
+                <w:iCs w:val="false"/>
+                <w:color w:val="2B2B33"/>
+                <w:sz w:val="19"/>
+                <w:szCs w:val="19"/>
+              </w:rPr>
+              <w:t xml:space="preserve">Medeiros</w:t>
+            </w:r>
+          </w:p>
+        </w:tc>
+        <w:tc>
+          <w:tcPr>
+            <w:tcW w:type="dxa" w:w="2379"/>
+            <w:tcBorders>
+              <w:top w:val="single" w:color="E6DFD2" w:sz="2"/>
+              <w:left w:val="single" w:color="E6DFD2" w:sz="2"/>
+              <w:bottom w:val="single" w:color="E6DFD2" w:sz="2"/>
+              <w:right w:val="single" w:color="E6DFD2" w:sz="2"/>
+            </w:tcBorders>
+            <w:shd w:fill="FFFFFF" w:val="clear"/>
+            <w:tcMar>
+              <w:top w:type="dxa" w:w="70"/>
+              <w:left w:type="dxa" w:w="110"/>
+              <w:bottom w:type="dxa" w:w="70"/>
+              <w:right w:type="dxa" w:w="110"/>
+            </w:tcMar>
+          </w:tcPr>
+          <w:p>
+            <w:pPr>
+              <w:spacing w:after="0" w:before="0" w:line="252" w:lineRule="auto"/>
+              <w:jc w:val="left"/>
+            </w:pPr>
+            <w:r>
+              <w:rPr>
+                <w:rFonts w:ascii="Cambria" w:cs="Cambria" w:eastAsia="Cambria" w:hAnsi="Cambria"/>
+                <w:b w:val="false"/>
+                <w:bCs w:val="false"/>
+                <w:i w:val="false"/>
+                <w:iCs w:val="false"/>
+                <w:color w:val="2B2B33"/>
+                <w:sz w:val="19"/>
+                <w:szCs w:val="19"/>
+              </w:rPr>
+              <w:t xml:space="preserve">"Jerônimo se castrou"; "Lei negativa, evangelho positivo"</w:t>
+            </w:r>
+          </w:p>
+        </w:tc>
+        <w:tc>
+          <w:tcPr>
+            <w:tcW w:type="dxa" w:w="4789"/>
+            <w:tcBorders>
+              <w:top w:val="single" w:color="E6DFD2" w:sz="2"/>
+              <w:left w:val="single" w:color="E6DFD2" w:sz="2"/>
+              <w:bottom w:val="single" w:color="E6DFD2" w:sz="2"/>
+              <w:right w:val="single" w:color="E6DFD2" w:sz="2"/>
+            </w:tcBorders>
+            <w:shd w:fill="FFFFFF" w:val="clear"/>
+            <w:tcMar>
+              <w:top w:type="dxa" w:w="70"/>
+              <w:left w:type="dxa" w:w="110"/>
+              <w:bottom w:type="dxa" w:w="70"/>
+              <w:right w:type="dxa" w:w="110"/>
+            </w:tcMar>
+          </w:tcPr>
+          <w:p>
+            <w:pPr>
+              <w:spacing w:after="0" w:before="0" w:line="252" w:lineRule="auto"/>
+              <w:jc w:val="left"/>
+            </w:pPr>
+            <w:r>
+              <w:rPr>
+                <w:rFonts w:ascii="Cambria" w:cs="Cambria" w:eastAsia="Cambria" w:hAnsi="Cambria"/>
+                <w:b w:val="false"/>
+                <w:bCs w:val="false"/>
+                <w:i w:val="false"/>
+                <w:iCs w:val="false"/>
+                <w:color w:val="2B2B33"/>
+                <w:sz w:val="19"/>
+                <w:szCs w:val="19"/>
+              </w:rPr>
+              <w:t xml:space="preserve">Orígenes (Eusébio, </w:t>
+            </w:r>
+            <w:r>
+              <w:rPr>
+                <w:rFonts w:ascii="Cambria" w:cs="Cambria" w:eastAsia="Cambria" w:hAnsi="Cambria"/>
+                <w:b w:val="false"/>
+                <w:bCs w:val="false"/>
+                <w:i/>
+                <w:iCs/>
+                <w:color w:val="2B2B33"/>
+                <w:sz w:val="19"/>
+                <w:szCs w:val="19"/>
+              </w:rPr>
+              <w:t xml:space="preserve">HE</w:t>
+            </w:r>
+            <w:r>
+              <w:rPr>
+                <w:rFonts w:ascii="Cambria" w:cs="Cambria" w:eastAsia="Cambria" w:hAnsi="Cambria"/>
+                <w:b w:val="false"/>
+                <w:bCs w:val="false"/>
+                <w:i w:val="false"/>
+                <w:iCs w:val="false"/>
+                <w:color w:val="2B2B33"/>
+                <w:sz w:val="19"/>
+                <w:szCs w:val="19"/>
+              </w:rPr>
+              <w:t xml:space="preserve"> VI.8); reformulado: a religião morta reduz a Lei aos "nãos"</w:t>
+            </w:r>
+          </w:p>
+        </w:tc>
+      </w:tr>
+      <w:tr>
+        <w:trPr>
+          <w:tblHeader w:val="false"/>
+        </w:trPr>
+        <w:tc>
+          <w:tcPr>
+            <w:tcW w:type="dxa" w:w="1498"/>
+            <w:tcBorders>
+              <w:top w:val="single" w:color="E6DFD2" w:sz="2"/>
+              <w:left w:val="single" w:color="E6DFD2" w:sz="2"/>
+              <w:bottom w:val="single" w:color="E6DFD2" w:sz="2"/>
+              <w:right w:val="single" w:color="E6DFD2" w:sz="2"/>
+            </w:tcBorders>
+            <w:shd w:fill="F4F1EA" w:val="clear"/>
+            <w:tcMar>
+              <w:top w:type="dxa" w:w="70"/>
+              <w:left w:type="dxa" w:w="110"/>
+              <w:bottom w:type="dxa" w:w="70"/>
+              <w:right w:type="dxa" w:w="110"/>
+            </w:tcMar>
+          </w:tcPr>
+          <w:p>
+            <w:pPr>
+              <w:spacing w:after="0" w:before="0" w:line="252" w:lineRule="auto"/>
+              <w:jc w:val="left"/>
+            </w:pPr>
+            <w:r>
+              <w:rPr>
+                <w:rFonts w:ascii="Cambria" w:cs="Cambria" w:eastAsia="Cambria" w:hAnsi="Cambria"/>
+                <w:b w:val="false"/>
+                <w:bCs w:val="false"/>
+                <w:i w:val="false"/>
+                <w:iCs w:val="false"/>
+                <w:color w:val="2B2B33"/>
+                <w:sz w:val="19"/>
+                <w:szCs w:val="19"/>
+              </w:rPr>
+              <w:t xml:space="preserve">Keller (sermão)</w:t>
+            </w:r>
+          </w:p>
+        </w:tc>
+        <w:tc>
+          <w:tcPr>
+            <w:tcW w:type="dxa" w:w="2379"/>
+            <w:tcBorders>
+              <w:top w:val="single" w:color="E6DFD2" w:sz="2"/>
+              <w:left w:val="single" w:color="E6DFD2" w:sz="2"/>
+              <w:bottom w:val="single" w:color="E6DFD2" w:sz="2"/>
+              <w:right w:val="single" w:color="E6DFD2" w:sz="2"/>
+            </w:tcBorders>
+            <w:shd w:fill="F4F1EA" w:val="clear"/>
+            <w:tcMar>
+              <w:top w:type="dxa" w:w="70"/>
+              <w:left w:type="dxa" w:w="110"/>
+              <w:bottom w:type="dxa" w:w="70"/>
+              <w:right w:type="dxa" w:w="110"/>
+            </w:tcMar>
+          </w:tcPr>
+          <w:p>
+            <w:pPr>
+              <w:spacing w:after="0" w:before="0" w:line="252" w:lineRule="auto"/>
+              <w:jc w:val="left"/>
+            </w:pPr>
+            <w:r>
+              <w:rPr>
+                <w:rFonts w:ascii="Cambria" w:cs="Cambria" w:eastAsia="Cambria" w:hAnsi="Cambria"/>
+                <w:b w:val="false"/>
+                <w:bCs w:val="false"/>
+                <w:i w:val="false"/>
+                <w:iCs w:val="false"/>
+                <w:color w:val="2B2B33"/>
+                <w:sz w:val="19"/>
+                <w:szCs w:val="19"/>
+              </w:rPr>
+              <w:t xml:space="preserve">A palavra do v. 13 é </w:t>
+            </w:r>
+            <w:r>
+              <w:rPr>
+                <w:rFonts w:ascii="Cambria" w:cs="Cambria" w:eastAsia="Cambria" w:hAnsi="Cambria"/>
+                <w:b w:val="false"/>
+                <w:bCs w:val="false"/>
+                <w:i/>
+                <w:iCs/>
+                <w:color w:val="2B2B33"/>
+                <w:sz w:val="19"/>
+                <w:szCs w:val="19"/>
+              </w:rPr>
+              <w:t xml:space="preserve">hilastērion</w:t>
+            </w:r>
+          </w:p>
+        </w:tc>
+        <w:tc>
+          <w:tcPr>
+            <w:tcW w:type="dxa" w:w="4789"/>
+            <w:tcBorders>
+              <w:top w:val="single" w:color="E6DFD2" w:sz="2"/>
+              <w:left w:val="single" w:color="E6DFD2" w:sz="2"/>
+              <w:bottom w:val="single" w:color="E6DFD2" w:sz="2"/>
+              <w:right w:val="single" w:color="E6DFD2" w:sz="2"/>
+            </w:tcBorders>
+            <w:shd w:fill="F4F1EA" w:val="clear"/>
+            <w:tcMar>
+              <w:top w:type="dxa" w:w="70"/>
+              <w:left w:type="dxa" w:w="110"/>
+              <w:bottom w:type="dxa" w:w="70"/>
+              <w:right w:type="dxa" w:w="110"/>
+            </w:tcMar>
+          </w:tcPr>
+          <w:p>
+            <w:pPr>
+              <w:spacing w:after="0" w:before="0" w:line="252" w:lineRule="auto"/>
+              <w:jc w:val="left"/>
+            </w:pPr>
+            <w:r>
+              <w:rPr>
+                <w:rFonts w:ascii="Cambria" w:cs="Cambria" w:eastAsia="Cambria" w:hAnsi="Cambria"/>
+                <w:b w:val="false"/>
+                <w:bCs w:val="false"/>
+                <w:i w:val="false"/>
+                <w:iCs w:val="false"/>
+                <w:color w:val="2B2B33"/>
+                <w:sz w:val="19"/>
+                <w:szCs w:val="19"/>
+              </w:rPr>
+              <w:t xml:space="preserve">É o verbo cognato </w:t>
+            </w:r>
+            <w:r>
+              <w:rPr>
+                <w:rFonts w:ascii="Cambria" w:cs="Cambria" w:eastAsia="Cambria" w:hAnsi="Cambria"/>
+                <w:b w:val="false"/>
+                <w:bCs w:val="false"/>
+                <w:i/>
+                <w:iCs/>
+                <w:color w:val="2B2B33"/>
+                <w:sz w:val="19"/>
+                <w:szCs w:val="19"/>
+              </w:rPr>
+              <w:t xml:space="preserve">hilaskomai</w:t>
+            </w:r>
+          </w:p>
+        </w:tc>
+      </w:tr>
+      <w:tr>
+        <w:trPr>
+          <w:tblHeader w:val="false"/>
+        </w:trPr>
+        <w:tc>
+          <w:tcPr>
+            <w:tcW w:type="dxa" w:w="1498"/>
+            <w:tcBorders>
+              <w:top w:val="single" w:color="E6DFD2" w:sz="2"/>
+              <w:left w:val="single" w:color="E6DFD2" w:sz="2"/>
+              <w:bottom w:val="single" w:color="E6DFD2" w:sz="2"/>
+              <w:right w:val="single" w:color="E6DFD2" w:sz="2"/>
+            </w:tcBorders>
+            <w:shd w:fill="FFFFFF" w:val="clear"/>
+            <w:tcMar>
+              <w:top w:type="dxa" w:w="70"/>
+              <w:left w:type="dxa" w:w="110"/>
+              <w:bottom w:type="dxa" w:w="70"/>
+              <w:right w:type="dxa" w:w="110"/>
+            </w:tcMar>
+          </w:tcPr>
+          <w:p>
+            <w:pPr>
+              <w:spacing w:after="0" w:before="0" w:line="252" w:lineRule="auto"/>
+              <w:jc w:val="left"/>
+            </w:pPr>
+            <w:r>
+              <w:rPr>
+                <w:rFonts w:ascii="Cambria" w:cs="Cambria" w:eastAsia="Cambria" w:hAnsi="Cambria"/>
+                <w:b w:val="false"/>
+                <w:bCs w:val="false"/>
+                <w:i w:val="false"/>
+                <w:iCs w:val="false"/>
+                <w:color w:val="2B2B33"/>
+                <w:sz w:val="19"/>
+                <w:szCs w:val="19"/>
+              </w:rPr>
+              <w:t xml:space="preserve">Wright</w:t>
+            </w:r>
+          </w:p>
+        </w:tc>
+        <w:tc>
+          <w:tcPr>
+            <w:tcW w:type="dxa" w:w="2379"/>
+            <w:tcBorders>
+              <w:top w:val="single" w:color="E6DFD2" w:sz="2"/>
+              <w:left w:val="single" w:color="E6DFD2" w:sz="2"/>
+              <w:bottom w:val="single" w:color="E6DFD2" w:sz="2"/>
+              <w:right w:val="single" w:color="E6DFD2" w:sz="2"/>
+            </w:tcBorders>
+            <w:shd w:fill="FFFFFF" w:val="clear"/>
+            <w:tcMar>
+              <w:top w:type="dxa" w:w="70"/>
+              <w:left w:type="dxa" w:w="110"/>
+              <w:bottom w:type="dxa" w:w="70"/>
+              <w:right w:type="dxa" w:w="110"/>
+            </w:tcMar>
+          </w:tcPr>
+          <w:p>
+            <w:pPr>
+              <w:spacing w:after="0" w:before="0" w:line="252" w:lineRule="auto"/>
+              <w:jc w:val="left"/>
+            </w:pPr>
+            <w:r>
+              <w:rPr>
+                <w:rFonts w:ascii="Cambria" w:cs="Cambria" w:eastAsia="Cambria" w:hAnsi="Cambria"/>
+                <w:b w:val="false"/>
+                <w:bCs w:val="false"/>
+                <w:i w:val="false"/>
+                <w:iCs w:val="false"/>
+                <w:color w:val="2B2B33"/>
+                <w:sz w:val="19"/>
+                <w:szCs w:val="19"/>
+              </w:rPr>
+              <w:t xml:space="preserve">Justificação final "após a vida de sofrimento, santidade e serviço"</w:t>
+            </w:r>
+          </w:p>
+        </w:tc>
+        <w:tc>
+          <w:tcPr>
+            <w:tcW w:type="dxa" w:w="4789"/>
+            <w:tcBorders>
+              <w:top w:val="single" w:color="E6DFD2" w:sz="2"/>
+              <w:left w:val="single" w:color="E6DFD2" w:sz="2"/>
+              <w:bottom w:val="single" w:color="E6DFD2" w:sz="2"/>
+              <w:right w:val="single" w:color="E6DFD2" w:sz="2"/>
+            </w:tcBorders>
+            <w:shd w:fill="FFFFFF" w:val="clear"/>
+            <w:tcMar>
+              <w:top w:type="dxa" w:w="70"/>
+              <w:left w:type="dxa" w:w="110"/>
+              <w:bottom w:type="dxa" w:w="70"/>
+              <w:right w:type="dxa" w:w="110"/>
+            </w:tcMar>
+          </w:tcPr>
+          <w:p>
+            <w:pPr>
+              <w:spacing w:after="0" w:before="0" w:line="252" w:lineRule="auto"/>
+              <w:jc w:val="left"/>
+            </w:pPr>
+            <w:r>
+              <w:rPr>
+                <w:rFonts w:ascii="Cambria" w:cs="Cambria" w:eastAsia="Cambria" w:hAnsi="Cambria"/>
+                <w:b w:val="false"/>
+                <w:bCs w:val="false"/>
+                <w:i w:val="false"/>
+                <w:iCs w:val="false"/>
+                <w:color w:val="2B2B33"/>
+                <w:sz w:val="19"/>
+                <w:szCs w:val="19"/>
+              </w:rPr>
               <w:t xml:space="preserve">Justificação pela fé somente; as obras como fruto e evidência (CFW XI.2; XVI.2)</w:t>
             </w:r>
           </w:p>
@@ -17131,7 +18087,185 @@
           <w:sz w:val="23"/>
           <w:szCs w:val="23"/>
         </w:rPr>
-        <w:t xml:space="preserve">. Stuttgart: Deutsche Bibelgesellschaft, 2006 [Sl 50.19; Is 53.11; Lv 16.29; Ez 33.13 a conferir]</w:t>
+        <w:t xml:space="preserve">. Stuttgart: Deutsche Bibelgesellschaft, 2006 [Sl 50.19; Is 53.11; Lv 16.29; Ez 33.13 a conferir]; Lactâncio, </w:t>
+      </w:r>
+      <w:r>
+        <w:rPr>
+          <w:rFonts w:ascii="Cambria" w:cs="Cambria" w:eastAsia="Cambria" w:hAnsi="Cambria"/>
+          <w:b w:val="false"/>
+          <w:bCs w:val="false"/>
+          <w:i/>
+          <w:iCs/>
+          <w:color w:val="2B2B33"/>
+          <w:sz w:val="23"/>
+          <w:szCs w:val="23"/>
+        </w:rPr>
+        <w:t xml:space="preserve">Divinae institutiones</w:t>
+      </w:r>
+      <w:r>
+        <w:rPr>
+          <w:rFonts w:ascii="Cambria" w:cs="Cambria" w:eastAsia="Cambria" w:hAnsi="Cambria"/>
+          <w:b w:val="false"/>
+          <w:bCs w:val="false"/>
+          <w:i w:val="false"/>
+          <w:iCs w:val="false"/>
+          <w:color w:val="2B2B33"/>
+          <w:sz w:val="23"/>
+          <w:szCs w:val="23"/>
+        </w:rPr>
+        <w:t xml:space="preserve"> IV.28; Cícero, </w:t>
+      </w:r>
+      <w:r>
+        <w:rPr>
+          <w:rFonts w:ascii="Cambria" w:cs="Cambria" w:eastAsia="Cambria" w:hAnsi="Cambria"/>
+          <w:b w:val="false"/>
+          <w:bCs w:val="false"/>
+          <w:i/>
+          <w:iCs/>
+          <w:color w:val="2B2B33"/>
+          <w:sz w:val="23"/>
+          <w:szCs w:val="23"/>
+        </w:rPr>
+        <w:t xml:space="preserve">De natura deorum</w:t>
+      </w:r>
+      <w:r>
+        <w:rPr>
+          <w:rFonts w:ascii="Cambria" w:cs="Cambria" w:eastAsia="Cambria" w:hAnsi="Cambria"/>
+          <w:b w:val="false"/>
+          <w:bCs w:val="false"/>
+          <w:i w:val="false"/>
+          <w:iCs w:val="false"/>
+          <w:color w:val="2B2B33"/>
+          <w:sz w:val="23"/>
+          <w:szCs w:val="23"/>
+        </w:rPr>
+        <w:t xml:space="preserve"> II.72</w:t>
+      </w:r>
+    </w:p>
+    <w:p>
+      <w:pPr>
+        <w:pStyle w:val="ListParagraph"/>
+        <w:numPr>
+          <w:ilvl w:val="0"/>
+          <w:numId w:val="2"/>
+        </w:numPr>
+        <w:spacing w:after="70" w:before="0" w:line="288" w:lineRule="auto"/>
+        <w:jc w:val="left"/>
+      </w:pPr>
+      <w:r>
+        <w:rPr>
+          <w:rFonts w:ascii="Cambria" w:cs="Cambria" w:eastAsia="Cambria" w:hAnsi="Cambria"/>
+          <w:b/>
+          <w:bCs/>
+          <w:i w:val="false"/>
+          <w:iCs w:val="false"/>
+          <w:color w:val="2B2B33"/>
+          <w:sz w:val="23"/>
+          <w:szCs w:val="23"/>
+        </w:rPr>
+        <w:t xml:space="preserve">Gênero dos Evangelhos</w:t>
+      </w:r>
+      <w:r>
+        <w:rPr>
+          <w:rFonts w:ascii="Cambria" w:cs="Cambria" w:eastAsia="Cambria" w:hAnsi="Cambria"/>
+          <w:b w:val="false"/>
+          <w:bCs w:val="false"/>
+          <w:i w:val="false"/>
+          <w:iCs w:val="false"/>
+          <w:color w:val="2B2B33"/>
+          <w:sz w:val="23"/>
+          <w:szCs w:val="23"/>
+        </w:rPr>
+        <w:t xml:space="preserve">: BURRIDGE, Richard A. </w:t>
+      </w:r>
+      <w:r>
+        <w:rPr>
+          <w:rFonts w:ascii="Cambria" w:cs="Cambria" w:eastAsia="Cambria" w:hAnsi="Cambria"/>
+          <w:b w:val="false"/>
+          <w:bCs w:val="false"/>
+          <w:i/>
+          <w:iCs/>
+          <w:color w:val="2B2B33"/>
+          <w:sz w:val="23"/>
+          <w:szCs w:val="23"/>
+        </w:rPr>
+        <w:t xml:space="preserve">What Are the Gospels? A Comparison with Graeco-Roman Biography</w:t>
+      </w:r>
+      <w:r>
+        <w:rPr>
+          <w:rFonts w:ascii="Cambria" w:cs="Cambria" w:eastAsia="Cambria" w:hAnsi="Cambria"/>
+          <w:b w:val="false"/>
+          <w:bCs w:val="false"/>
+          <w:i w:val="false"/>
+          <w:iCs w:val="false"/>
+          <w:color w:val="2B2B33"/>
+          <w:sz w:val="23"/>
+          <w:szCs w:val="23"/>
+        </w:rPr>
+        <w:t xml:space="preserve">. 2. ed. Grand Rapids: Eerdmans, 2004 [p. a conferir]</w:t>
+      </w:r>
+    </w:p>
+    <w:p>
+      <w:pPr>
+        <w:pStyle w:val="ListParagraph"/>
+        <w:numPr>
+          <w:ilvl w:val="0"/>
+          <w:numId w:val="2"/>
+        </w:numPr>
+        <w:spacing w:after="70" w:before="0" w:line="288" w:lineRule="auto"/>
+        <w:jc w:val="left"/>
+      </w:pPr>
+      <w:r>
+        <w:rPr>
+          <w:rFonts w:ascii="Cambria" w:cs="Cambria" w:eastAsia="Cambria" w:hAnsi="Cambria"/>
+          <w:b/>
+          <w:bCs/>
+          <w:i w:val="false"/>
+          <w:iCs w:val="false"/>
+          <w:color w:val="2B2B33"/>
+          <w:sz w:val="23"/>
+          <w:szCs w:val="23"/>
+        </w:rPr>
+        <w:t xml:space="preserve">Sermão do Allan, transcrição revisada</w:t>
+      </w:r>
+      <w:r>
+        <w:rPr>
+          <w:rFonts w:ascii="Cambria" w:cs="Cambria" w:eastAsia="Cambria" w:hAnsi="Cambria"/>
+          <w:b w:val="false"/>
+          <w:bCs w:val="false"/>
+          <w:i w:val="false"/>
+          <w:iCs w:val="false"/>
+          <w:color w:val="2B2B33"/>
+          <w:sz w:val="23"/>
+          <w:szCs w:val="23"/>
+        </w:rPr>
+        <w:t xml:space="preserve"> (Apêndice J): ACIOLY, Allan David Lessa. </w:t>
+      </w:r>
+      <w:r>
+        <w:rPr>
+          <w:rFonts w:ascii="Cambria" w:cs="Cambria" w:eastAsia="Cambria" w:hAnsi="Cambria"/>
+          <w:b w:val="false"/>
+          <w:bCs w:val="false"/>
+          <w:i/>
+          <w:iCs/>
+          <w:color w:val="2B2B33"/>
+          <w:sz w:val="23"/>
+          <w:szCs w:val="23"/>
+        </w:rPr>
+        <w:t xml:space="preserve">Três modos de viver e um que agrada a Deus</w:t>
+      </w:r>
+      <w:r>
+        <w:rPr>
+          <w:rFonts w:ascii="Cambria" w:cs="Cambria" w:eastAsia="Cambria" w:hAnsi="Cambria"/>
+          <w:b w:val="false"/>
+          <w:bCs w:val="false"/>
+          <w:i w:val="false"/>
+          <w:iCs w:val="false"/>
+          <w:color w:val="2B2B33"/>
+          <w:sz w:val="23"/>
+          <w:szCs w:val="23"/>
+        </w:rPr>
+        <w:t xml:space="preserve">. Sermão em Lc 18.9-14. Igreja Presbiteriana Esperança, jan. 2022. Transcrição revisada</w:t>
       </w:r>
     </w:p>
     <w:p>
@@ -20267,7 +21401,33 @@
           <w:sz w:val="23"/>
           <w:szCs w:val="23"/>
         </w:rPr>
-        <w:t xml:space="preserve"> (Ferguson, via Keller): na forma legalista, Deus não é generoso; o favor dele tem de ser conquistado. O fariseu pressupõe um Deus que se impressiona com atos de piedade e sentimentos de superioridade; o publicano espera um Deus de misericórdia (Snodgrass: "duas imagens de Deus"). O Deus do fariseu é um contador que confere o balanço, feito à imagem do fariseu</w:t>
+        <w:t xml:space="preserve"> (Ferguson, via Keller): na forma legalista, Deus não é generoso; o favor dele tem de ser conquistado. O fariseu pressupõe um Deus que se impressiona com atos de piedade e sentimentos de superioridade; o publicano espera um Deus de misericórdia (Snodgrass: "duas imagens de Deus"). O Deus do fariseu é um contador que confere o balanço, feito à imagem do fariseu. </w:t>
+      </w:r>
+      <w:r>
+        <w:rPr>
+          <w:rFonts w:ascii="Cambria" w:cs="Cambria" w:eastAsia="Cambria" w:hAnsi="Cambria"/>
+          <w:b/>
+          <w:bCs/>
+          <w:i w:val="false"/>
+          <w:iCs w:val="false"/>
+          <w:color w:val="2B2B33"/>
+          <w:sz w:val="23"/>
+          <w:szCs w:val="23"/>
+        </w:rPr>
+        <w:t xml:space="preserve">E o combustível é o medo</w:t>
+      </w:r>
+      <w:r>
+        <w:rPr>
+          <w:rFonts w:ascii="Cambria" w:cs="Cambria" w:eastAsia="Cambria" w:hAnsi="Cambria"/>
+          <w:b w:val="false"/>
+          <w:bCs w:val="false"/>
+          <w:i w:val="false"/>
+          <w:iCs w:val="false"/>
+          <w:color w:val="2B2B33"/>
+          <w:sz w:val="23"/>
+          <w:szCs w:val="23"/>
+        </w:rPr>
+        <w:t xml:space="preserve">: a cerca da Lei nasceu, provavelmente, do propósito de nunca mais perder o favor de Deus (1.3, Histórico; Allan 2022), e a obediência movida pelo medo de rejeição já pressupõe um Deus avarento de favor. "No amor não existe medo; pelo contrário, o perfeito amor lança fora o medo. Porque o medo envolve castigo" (1Jo 4.18)</w:t>
       </w:r>
     </w:p>
     <w:p>
@@ -20432,7 +21592,59 @@
           <w:sz w:val="23"/>
           <w:szCs w:val="23"/>
         </w:rPr>
-        <w:t xml:space="preserve">, III.8).</w:t>
+        <w:t xml:space="preserve">, III.8). O vínculo também se lê ao contrário: "quem não ama o seu irmão, a quem vê, não pode amar a Deus, a quem não vê" (1Jo 4.20). Por fora, o convertido e o não convertido podem fazer as mesmas coisas (orar, ofertar, servir, ser batizado, tomar a Ceia); o que os distingue é se amam Jesus, e isso aparece </w:t>
+      </w:r>
+      <w:r>
+        <w:rPr>
+          <w:rFonts w:ascii="Cambria" w:cs="Cambria" w:eastAsia="Cambria" w:hAnsi="Cambria"/>
+          <w:b/>
+          <w:bCs/>
+          <w:i w:val="false"/>
+          <w:iCs w:val="false"/>
+          <w:color w:val="2B2B33"/>
+          <w:sz w:val="23"/>
+          <w:szCs w:val="23"/>
+        </w:rPr>
+        <w:t xml:space="preserve">no trato com as pessoas</w:t>
+      </w:r>
+      <w:r>
+        <w:rPr>
+          <w:rFonts w:ascii="Cambria" w:cs="Cambria" w:eastAsia="Cambria" w:hAnsi="Cambria"/>
+          <w:b w:val="false"/>
+          <w:bCs w:val="false"/>
+          <w:i w:val="false"/>
+          <w:iCs w:val="false"/>
+          <w:color w:val="2B2B33"/>
+          <w:sz w:val="23"/>
+          <w:szCs w:val="23"/>
+        </w:rPr>
+        <w:t xml:space="preserve"> e </w:t>
+      </w:r>
+      <w:r>
+        <w:rPr>
+          <w:rFonts w:ascii="Cambria" w:cs="Cambria" w:eastAsia="Cambria" w:hAnsi="Cambria"/>
+          <w:b/>
+          <w:bCs/>
+          <w:i w:val="false"/>
+          <w:iCs w:val="false"/>
+          <w:color w:val="2B2B33"/>
+          <w:sz w:val="23"/>
+          <w:szCs w:val="23"/>
+        </w:rPr>
+        <w:t xml:space="preserve">no lugar do deleite</w:t>
+      </w:r>
+      <w:r>
+        <w:rPr>
+          <w:rFonts w:ascii="Cambria" w:cs="Cambria" w:eastAsia="Cambria" w:hAnsi="Cambria"/>
+          <w:b w:val="false"/>
+          <w:bCs w:val="false"/>
+          <w:i w:val="false"/>
+          <w:iCs w:val="false"/>
+          <w:color w:val="2B2B33"/>
+          <w:sz w:val="23"/>
+          <w:szCs w:val="23"/>
+        </w:rPr>
+        <w:t xml:space="preserve">: servir uma instituição religiosa ou estar com o Senhor e com os irmãos (Allan 2022).</w:t>
       </w:r>
     </w:p>
     <w:p>
@@ -23338,6 +24550,90 @@
           <w:sz w:val="23"/>
           <w:szCs w:val="23"/>
         </w:rPr>
+        <w:t xml:space="preserve">O desigrejado</w:t>
+      </w:r>
+      <w:r>
+        <w:rPr>
+          <w:rFonts w:ascii="Cambria" w:cs="Cambria" w:eastAsia="Cambria" w:hAnsi="Cambria"/>
+          <w:b w:val="false"/>
+          <w:bCs w:val="false"/>
+          <w:i w:val="false"/>
+          <w:iCs w:val="false"/>
+          <w:color w:val="2B2B33"/>
+          <w:sz w:val="23"/>
+          <w:szCs w:val="23"/>
+        </w:rPr>
+        <w:t xml:space="preserve"> (Allan 2022). Quem tenta se aproximar de Deus pelas próprias forças tem duas saídas quando o currículo quebra: "ou viro um cínico dentro da instituição religiosa, ou viro desigrejado e abandono tudo". O desigrejado é um fenômeno enorme no Brasil, e é preciso separar as duas coisas que ele costuma trazer. Há </w:t>
+      </w:r>
+      <w:r>
+        <w:rPr>
+          <w:rFonts w:ascii="Cambria" w:cs="Cambria" w:eastAsia="Cambria" w:hAnsi="Cambria"/>
+          <w:b/>
+          <w:bCs/>
+          <w:i w:val="false"/>
+          <w:iCs w:val="false"/>
+          <w:color w:val="2B2B33"/>
+          <w:sz w:val="23"/>
+          <w:szCs w:val="23"/>
+        </w:rPr>
+        <w:t xml:space="preserve">a ferida real</w:t>
+      </w:r>
+      <w:r>
+        <w:rPr>
+          <w:rFonts w:ascii="Cambria" w:cs="Cambria" w:eastAsia="Cambria" w:hAnsi="Cambria"/>
+          <w:b w:val="false"/>
+          <w:bCs w:val="false"/>
+          <w:i w:val="false"/>
+          <w:iCs w:val="false"/>
+          <w:color w:val="2B2B33"/>
+          <w:sz w:val="23"/>
+          <w:szCs w:val="23"/>
+        </w:rPr>
+        <w:t xml:space="preserve"> (abuso espiritual, liderança que explorou), que pede cuidado e não sermão. E há, às vezes, </w:t>
+      </w:r>
+      <w:r>
+        <w:rPr>
+          <w:rFonts w:ascii="Cambria" w:cs="Cambria" w:eastAsia="Cambria" w:hAnsi="Cambria"/>
+          <w:b/>
+          <w:bCs/>
+          <w:i w:val="false"/>
+          <w:iCs w:val="false"/>
+          <w:color w:val="2B2B33"/>
+          <w:sz w:val="23"/>
+          <w:szCs w:val="23"/>
+        </w:rPr>
+        <w:t xml:space="preserve">o fariseu invertido</w:t>
+      </w:r>
+      <w:r>
+        <w:rPr>
+          <w:rFonts w:ascii="Cambria" w:cs="Cambria" w:eastAsia="Cambria" w:hAnsi="Cambria"/>
+          <w:b w:val="false"/>
+          <w:bCs w:val="false"/>
+          <w:i w:val="false"/>
+          <w:iCs w:val="false"/>
+          <w:color w:val="2B2B33"/>
+          <w:sz w:val="23"/>
+          <w:szCs w:val="23"/>
+        </w:rPr>
+        <w:t xml:space="preserve">: "graças te dou porque não sou como esses crentes hipócritas". A primeira se trata com a verdade e o tempo; a segunda é a mesma oração do v. 11, dita do lado de fora do templo.</w:t>
+      </w:r>
+    </w:p>
+    <w:p>
+      <w:pPr>
+        <w:spacing w:after="150" w:before="0" w:line="300" w:lineRule="auto"/>
+        <w:jc w:val="left"/>
+      </w:pPr>
+      <w:r>
+        <w:rPr>
+          <w:rFonts w:ascii="Cambria" w:cs="Cambria" w:eastAsia="Cambria" w:hAnsi="Cambria"/>
+          <w:b/>
+          <w:bCs/>
+          <w:i w:val="false"/>
+          <w:iCs w:val="false"/>
+          <w:color w:val="2B2B33"/>
+          <w:sz w:val="23"/>
+          <w:szCs w:val="23"/>
+        </w:rPr>
         <w:t xml:space="preserve">A oração como autocuidado</w:t>
       </w:r>
       <w:r>
@@ -25614,6 +26910,90 @@
           <w:sz w:val="23"/>
           <w:szCs w:val="23"/>
         </w:rPr>
+        <w:t xml:space="preserve">Uma palavra sobre "religião"</w:t>
+      </w:r>
+      <w:r>
+        <w:rPr>
+          <w:rFonts w:ascii="Cambria" w:cs="Cambria" w:eastAsia="Cambria" w:hAnsi="Cambria"/>
+          <w:b w:val="false"/>
+          <w:bCs w:val="false"/>
+          <w:i w:val="false"/>
+          <w:iCs w:val="false"/>
+          <w:color w:val="2B2B33"/>
+          <w:sz w:val="23"/>
+          <w:szCs w:val="23"/>
+        </w:rPr>
+        <w:t xml:space="preserve"> (Allan 2022 já fazia a ressalva no púlpito). Quando o sermão contrapõe "religião" e "evangelho" (a matriz de Keller: "obedeço, logo sou aceito" × "sou aceito, logo obedeço"), a palavra está em sentido negativo: religião como </w:t>
+      </w:r>
+      <w:r>
+        <w:rPr>
+          <w:rFonts w:ascii="Cambria" w:cs="Cambria" w:eastAsia="Cambria" w:hAnsi="Cambria"/>
+          <w:b/>
+          <w:bCs/>
+          <w:i w:val="false"/>
+          <w:iCs w:val="false"/>
+          <w:color w:val="2B2B33"/>
+          <w:sz w:val="23"/>
+          <w:szCs w:val="23"/>
+        </w:rPr>
+        <w:t xml:space="preserve">meio de salvação</w:t>
+      </w:r>
+      <w:r>
+        <w:rPr>
+          <w:rFonts w:ascii="Cambria" w:cs="Cambria" w:eastAsia="Cambria" w:hAnsi="Cambria"/>
+          <w:b w:val="false"/>
+          <w:bCs w:val="false"/>
+          <w:i w:val="false"/>
+          <w:iCs w:val="false"/>
+          <w:color w:val="2B2B33"/>
+          <w:sz w:val="23"/>
+          <w:szCs w:val="23"/>
+        </w:rPr>
+        <w:t xml:space="preserve">. A Escritura a usa também em sentido bom: "A religião pura e sem mácula para com o nosso Deus e Pai é esta: visitar os órfãos e as viúvas nas suas aflições e guardar-se incontaminado do mundo" (Tg 1.27, NAA). E a etimologia </w:t>
+      </w:r>
+      <w:r>
+        <w:rPr>
+          <w:rFonts w:ascii="Cambria" w:cs="Cambria" w:eastAsia="Cambria" w:hAnsi="Cambria"/>
+          <w:b w:val="false"/>
+          <w:bCs w:val="false"/>
+          <w:i/>
+          <w:iCs/>
+          <w:color w:val="2B2B33"/>
+          <w:sz w:val="23"/>
+          <w:szCs w:val="23"/>
+        </w:rPr>
+        <w:t xml:space="preserve">religare</w:t>
+      </w:r>
+      <w:r>
+        <w:rPr>
+          <w:rFonts w:ascii="Cambria" w:cs="Cambria" w:eastAsia="Cambria" w:hAnsi="Cambria"/>
+          <w:b w:val="false"/>
+          <w:bCs w:val="false"/>
+          <w:i w:val="false"/>
+          <w:iCs w:val="false"/>
+          <w:color w:val="2B2B33"/>
+          <w:sz w:val="23"/>
+          <w:szCs w:val="23"/>
+        </w:rPr>
+        <w:t xml:space="preserve"> não sustenta argumento (ver 1.6). O alvo é a confiança em si, não a piedade.</w:t>
+      </w:r>
+    </w:p>
+    <w:p>
+      <w:pPr>
+        <w:spacing w:after="150" w:before="0" w:line="300" w:lineRule="auto"/>
+        <w:jc w:val="left"/>
+      </w:pPr>
+      <w:r>
+        <w:rPr>
+          <w:rFonts w:ascii="Cambria" w:cs="Cambria" w:eastAsia="Cambria" w:hAnsi="Cambria"/>
+          <w:b/>
+          <w:bCs/>
+          <w:i w:val="false"/>
+          <w:iCs w:val="false"/>
+          <w:color w:val="2B2B33"/>
+          <w:sz w:val="23"/>
+          <w:szCs w:val="23"/>
+        </w:rPr>
         <w:t xml:space="preserve">Versão moralista</w:t>
       </w:r>
     </w:p>
@@ -26466,7 +27846,7 @@
           <w:sz w:val="23"/>
           <w:szCs w:val="23"/>
         </w:rPr>
-        <w:t xml:space="preserve"> "Só Deus pode me julgar"? Exatamente por isso o ouvinte deveria ter medo (Allan 2022): Deus vê o coração "à luz do dia" (Hb 4.13). O tribunal não está vazio (contra Arthur Miller): "Digo a vocês", diz o Juiz</w:t>
+        <w:t xml:space="preserve"> "Só Deus pode me julgar"? Exatamente por isso o ouvinte deveria ter medo (Allan 2022): Deus vê o coração "à luz do dia" (Hb 4.13). O tribunal não está vazio (contra Arthur Miller): "Digo a vocês", diz o Juiz. E a frase tem uma versão verdadeira: "quem me julga é o Senhor" (1Co 4.4), dita por quem se recusa a dar a si mesmo o veredito. Na boca do mundo, "só Deus pode me julgar" é fuga; na de Paulo, é descanso</w:t>
       </w:r>
     </w:p>
     <w:p>
@@ -26679,7 +28059,7 @@
           <w:sz w:val="23"/>
           <w:szCs w:val="23"/>
         </w:rPr>
-        <w:t xml:space="preserve"> do desempenho. E a fórmula: "mais pecador do que jamais ousei crer, mais amado e aceito do que jamais ousei esperar" (Keller, </w:t>
+        <w:t xml:space="preserve"> do desempenho. O texto de Keller para isso é 1Co 4.3-4: "nem eu julgo a mim mesmo… quem me julga é o Senhor". Quem recebeu o veredito de Deus deixa de abrir sessão no tribunal de si mesmo, para se condenar ou para se absolver (ver 1.3, Bíblico). E a fórmula: "mais pecador do que jamais ousei crer, mais amado e aceito do que jamais ousei esperar" (Keller, </w:t>
       </w:r>
       <w:r>
         <w:rPr>
@@ -29447,7 +30827,7 @@
           <w:sz w:val="23"/>
           <w:szCs w:val="23"/>
         </w:rPr>
-        <w:t xml:space="preserve"> pecadores, sem ser um deles. A nossa exaltação é a participação na dele. Os dois homens ficaram de pé no templo; o nosso Sumo Sacerdote "assentou-se à direita de Deus", porque o sacrifício está consumado (Hb 10.11-12; Sherman; ponte homilética, não leitura de Lucas). E "o mesmo Jesus que recomendou a oração do publicano está assentado à direita de Deus para receber os pecadores" (Ryle).</w:t>
+        <w:t xml:space="preserve"> pecadores, sem ser um deles. A nossa exaltação é a participação na dele. Os dois homens ficaram de pé no templo; o nosso Sumo Sacerdote "assentou-se à direita de Deus", porque o sacrifício está consumado (Hb 10.11-12; Sherman; ponte homilética, não leitura de Lucas). E ele não é só o Sacerdote que oferece; é a oferta: "fez isto uma vez por todas, quando a si mesmo ofereceu" (Hb 7.27); "a si mesmo ofereceu sem mácula a Deus" (Hb 9.14). Ou, como no púlpito de 2022: "não foi somente o sumo sacerdote que preparou o sacrifício, mas foi o próprio sacrifício" (Allan). E "o mesmo Jesus que recomendou a oração do publicano está assentado à direita de Deus para receber os pecadores" (Ryle).</w:t>
       </w:r>
     </w:p>
     <w:p>
@@ -30674,7 +32054,7 @@
           <w:sz w:val="23"/>
           <w:szCs w:val="23"/>
         </w:rPr>
-        <w:t xml:space="preserve">: não se sentir perdoado antes de passar muito tempo em miséria, como se a culpa sentida pagasse a dívida (o "publicano invertido"). O peito batido não paga nada; pede. O senso de pecado não dá direito à misericórdia (Spurgeon)</w:t>
+        <w:t xml:space="preserve">: não se sentir perdoado antes de passar muito tempo em miséria, como se a culpa sentida pagasse a dívida (o "publicano invertido"). O peito batido não paga nada; pede. O senso de pecado não dá direito à misericórdia (Spurgeon). A tristeza pelo pecado é boa e é dom ("a tristeza segundo Deus produz arrependimento para a salvação… mas a tristeza do mundo produz morte", 2Co 7.10); o erro é transformá-la em pagamento. E vale vigiar a pergunta que se faz depois da queda (Allan 2022): "como pude? eu não sou assim" é a autoimagem ferida, o currículo manchado; "como ainda abuso do teu amor?" é a tristeza segundo Deus</w:t>
       </w:r>
     </w:p>
     <w:p>
@@ -31083,7 +32463,7 @@
           <w:sz w:val="23"/>
           <w:szCs w:val="23"/>
         </w:rPr>
-        <w:t xml:space="preserve"> As quatro perguntas de Ryken: quando me comparo com os outros e me congratulo por ser mais espiritual; quando fico impressionado com o quanto dou a Deus; quando passo a semana sem confessar nenhum pecado específico; quando os pecados dos outros me parecem mais graves que os meus. E três sinais de que o disjuntor desarmou (Keller, via Allan 2022): só me sinto perdoado depois de muita miséria; ando orgulhoso e rude; vivo me sentindo um fracasso. E um teste: </w:t>
+        <w:t xml:space="preserve"> As quatro perguntas de Ryken: quando me comparo com os outros e me congratulo por ser mais espiritual; quando fico impressionado com o quanto dou a Deus; quando passo a semana sem confessar nenhum pecado específico; quando os pecados dos outros me parecem mais graves que os meus. E três sinais de que o disjuntor desarmou (Keller, via Allan 2022): só me sinto perdoado depois de muita miséria; ando orgulhoso e rude; vivo me sentindo um fracasso. E dois testes: </w:t>
       </w:r>
       <w:r>
         <w:rPr>
@@ -31097,6 +32477,45 @@
           <w:szCs w:val="23"/>
         </w:rPr>
         <w:t xml:space="preserve">como reajo à crítica?</w:t>
+      </w:r>
+      <w:r>
+        <w:rPr>
+          <w:rFonts w:ascii="Cambria" w:cs="Cambria" w:eastAsia="Cambria" w:hAnsi="Cambria"/>
+          <w:b w:val="false"/>
+          <w:bCs w:val="false"/>
+          <w:i w:val="false"/>
+          <w:iCs w:val="false"/>
+          <w:color w:val="2B2B33"/>
+          <w:sz w:val="23"/>
+          <w:szCs w:val="23"/>
+        </w:rPr>
+        <w:t xml:space="preserve"> e </w:t>
+      </w:r>
+      <w:r>
+        <w:rPr>
+          <w:rFonts w:ascii="Cambria" w:cs="Cambria" w:eastAsia="Cambria" w:hAnsi="Cambria"/>
+          <w:b/>
+          <w:bCs/>
+          <w:i w:val="false"/>
+          <w:iCs w:val="false"/>
+          <w:color w:val="2B2B33"/>
+          <w:sz w:val="23"/>
+          <w:szCs w:val="23"/>
+        </w:rPr>
+        <w:t xml:space="preserve">onde está o meu deleite</w:t>
+      </w:r>
+      <w:r>
+        <w:rPr>
+          <w:rFonts w:ascii="Cambria" w:cs="Cambria" w:eastAsia="Cambria" w:hAnsi="Cambria"/>
+          <w:b w:val="false"/>
+          <w:bCs w:val="false"/>
+          <w:i w:val="false"/>
+          <w:iCs w:val="false"/>
+          <w:color w:val="2B2B33"/>
+          <w:sz w:val="23"/>
+          <w:szCs w:val="23"/>
+        </w:rPr>
+        <w:t xml:space="preserve">: em servir a instituição ou em estar com o Senhor e com os irmãos? (1Jo 4.20; Allan 2022)</w:t>
       </w:r>
     </w:p>
     <w:p>
@@ -31244,7 +32663,7 @@
           <w:sz w:val="23"/>
           <w:szCs w:val="23"/>
         </w:rPr>
-        <w:t xml:space="preserve"> A mesa é dos pecadores justificados (Lc 5.31-32): examinar-se (1Co 11.28) é reconhecer o pecado, voltar-se dele e confiar só em Cristo (CM 171-175; CFW XXIX.8), não provar que é digno. "Colocamos as mãos da nossa fé sobre Jesus, o sacrifício perfeito" (Ryken)</w:t>
+        <w:t xml:space="preserve"> A mesa é dos pecadores justificados (Lc 5.31-32): examinar-se (1Co 11.28) é reconhecer o pecado, voltar-se dele e confiar só em Cristo (CM 171-175; CFW XXIX.8), não provar que é digno. "Colocamos as mãos da nossa fé sobre Jesus, o sacrifício perfeito" (Ryken). Os meios de graça (a Palavra, os sacramentos e a oração, BC 88) são o religar regular do disjuntor: "quando você vem num culto como esse, bateu o disjuntor do evangelho" (Allan 2022)</w:t>
       </w:r>
     </w:p>
     <w:p>
@@ -32312,7 +33731,7 @@
           <w:sz w:val="23"/>
           <w:szCs w:val="23"/>
         </w:rPr>
-        <w:t xml:space="preserve">Padrões de Westminster: CFW XI.1-3, XI.6, XXIX.8; CM 99, 171-175; BC 33 [redação a conferir]</w:t>
+        <w:t xml:space="preserve">Padrões de Westminster: CFW XI.1-3, XI.6, XXIX.8; CM 99, 171-175; BC 33, 88 [redação a conferir]</w:t>
       </w:r>
     </w:p>
     <w:p>
@@ -46787,7 +48206,7 @@
           <w:sz w:val="23"/>
           <w:szCs w:val="23"/>
         </w:rPr>
-        <w:t xml:space="preserve">Este estudo consolida a pesquisa inicial e todos os materiais anexados pelo Allan (estudos de IA, comentários exegéticos, especialistas em parábolas, expositores, vozes pastorais, sermões e o material do próprio Allan). A análise detalhada de cada material (Apêndices A a I) e a versão 1 do esboço estão registradas no arquivo de estudo em markdown, estudos/lucas/18-9-14.md.</w:t>
+        <w:t xml:space="preserve">Este estudo consolida a pesquisa inicial e todos os materiais anexados pelo Allan (estudos de IA, comentários exegéticos, especialistas em parábolas, expositores, vozes pastorais, sermões e o material do próprio Allan, inclusive a transcrição revisada do sermão de 2022). A análise detalhada de cada material (Apêndices A a J) e a versão 1 do esboço estão registradas no arquivo de estudo em markdown, estudos/lucas/18-9-14.md.</w:t>
       </w:r>
     </w:p>
     <w:p>

</xml_diff>